<commit_message>
modificación docs adjuntos, previo texto
</commit_message>
<xml_diff>
--- a/public/assets/investors/4Zerocog_a_reiesg_mitig.docx
+++ b/public/assets/investors/4Zerocog_a_reiesg_mitig.docx
@@ -11,17 +11,27 @@
         </w:numPr>
         <w:bidi w:val="0"/>
         <w:spacing w:before="240" w:after="120"/>
-        <w:jc w:val="left"/>
-        <w:rPr/>
-      </w:pPr>
-      <w:r>
-        <w:rPr>
-          <w:rStyle w:val="Destaquemayor"/>
+        <w:ind w:left="0" w:hanging="0"/>
+        <w:jc w:val="left"/>
+        <w:rPr/>
+      </w:pPr>
+      <w:r>
+        <w:rPr>
+          <w:rStyle w:val="Strong"/>
           <w:b/>
           <w:sz w:val="40"/>
           <w:szCs w:val="40"/>
         </w:rPr>
-        <w:t>Simbiotyc: Análisis de Riesgos Técnicos y Mitigaciones</w:t>
+        <w:t>Zerocog</w:t>
+      </w:r>
+      <w:r>
+        <w:rPr>
+          <w:rStyle w:val="Strong"/>
+          <w:b/>
+          <w:sz w:val="40"/>
+          <w:szCs w:val="40"/>
+        </w:rPr>
+        <w:t>: Análisis de Riesgos Técnicos y Mitigaciones</w:t>
       </w:r>
     </w:p>
     <w:p>
@@ -33,12 +43,13 @@
         </w:numPr>
         <w:bidi w:val="0"/>
         <w:spacing w:before="200" w:after="120"/>
-        <w:jc w:val="left"/>
-        <w:rPr/>
-      </w:pPr>
-      <w:r>
-        <w:rPr>
-          <w:rStyle w:val="Destaquemayor"/>
+        <w:ind w:left="0" w:hanging="0"/>
+        <w:jc w:val="left"/>
+        <w:rPr/>
+      </w:pPr>
+      <w:r>
+        <w:rPr>
+          <w:rStyle w:val="Strong"/>
           <w:b/>
         </w:rPr>
         <w:t>1. Riesgo: Anonimización Insuficiente o Reversible</w:t>
@@ -54,7 +65,7 @@
       </w:pPr>
       <w:r>
         <w:rPr>
-          <w:rStyle w:val="Destaquemayor"/>
+          <w:rStyle w:val="Strong"/>
         </w:rPr>
         <w:t>Descripción:</w:t>
       </w:r>
@@ -68,10 +79,76 @@
         <w:pStyle w:val="Cuerpodetexto"/>
         <w:numPr>
           <w:ilvl w:val="0"/>
+          <w:numId w:val="1"/>
+        </w:numPr>
+        <w:tabs>
+          <w:tab w:val="left" w:pos="709" w:leader="none"/>
+        </w:tabs>
+        <w:bidi w:val="0"/>
+        <w:ind w:left="709" w:hanging="283"/>
+        <w:jc w:val="left"/>
+        <w:rPr/>
+      </w:pPr>
+      <w:r>
+        <w:rPr>
+          <w:rStyle w:val="Strong"/>
+        </w:rPr>
+        <w:t>Probabilidad:</w:t>
+      </w:r>
+      <w:r>
+        <w:rPr/>
+        <w:t xml:space="preserve"> Media</w:t>
+      </w:r>
+    </w:p>
+    <w:p>
+      <w:pPr>
+        <w:pStyle w:val="Cuerpodetexto"/>
+        <w:numPr>
+          <w:ilvl w:val="0"/>
+          <w:numId w:val="1"/>
+        </w:numPr>
+        <w:tabs>
+          <w:tab w:val="left" w:pos="709" w:leader="none"/>
+        </w:tabs>
+        <w:bidi w:val="0"/>
+        <w:ind w:left="709" w:hanging="283"/>
+        <w:jc w:val="left"/>
+        <w:rPr/>
+      </w:pPr>
+      <w:r>
+        <w:rPr>
+          <w:rStyle w:val="Strong"/>
+        </w:rPr>
+        <w:t>Impacto:</w:t>
+      </w:r>
+      <w:r>
+        <w:rPr/>
+        <w:t xml:space="preserve"> Crítico</w:t>
+      </w:r>
+    </w:p>
+    <w:p>
+      <w:pPr>
+        <w:pStyle w:val="Cuerpodetexto"/>
+        <w:bidi w:val="0"/>
+        <w:spacing w:lineRule="auto" w:line="276" w:before="0" w:after="140"/>
+        <w:jc w:val="left"/>
+        <w:rPr/>
+      </w:pPr>
+      <w:r>
+        <w:rPr>
+          <w:rStyle w:val="Strong"/>
+        </w:rPr>
+        <w:t>Mitigaciones:</w:t>
+      </w:r>
+    </w:p>
+    <w:p>
+      <w:pPr>
+        <w:pStyle w:val="Cuerpodetexto"/>
+        <w:numPr>
+          <w:ilvl w:val="0"/>
           <w:numId w:val="2"/>
         </w:numPr>
         <w:tabs>
-          <w:tab w:val="clear" w:pos="709"/>
           <w:tab w:val="left" w:pos="709" w:leader="none"/>
         </w:tabs>
         <w:bidi w:val="0"/>
@@ -80,13 +157,372 @@
         <w:rPr/>
       </w:pPr>
       <w:r>
-        <w:rPr>
-          <w:rStyle w:val="Destaquemayor"/>
+        <w:rPr/>
+        <w:t xml:space="preserve">Implementar </w:t>
+      </w:r>
+      <w:r>
+        <w:rPr>
+          <w:rStyle w:val="Strong"/>
+        </w:rPr>
+        <w:t>Private Differential Privacy</w:t>
+      </w:r>
+      <w:r>
+        <w:rPr/>
+        <w:t xml:space="preserve"> en capa semántica (ε≤1.0)</w:t>
+      </w:r>
+    </w:p>
+    <w:p>
+      <w:pPr>
+        <w:pStyle w:val="Cuerpodetexto"/>
+        <w:numPr>
+          <w:ilvl w:val="0"/>
+          <w:numId w:val="2"/>
+        </w:numPr>
+        <w:tabs>
+          <w:tab w:val="left" w:pos="709" w:leader="none"/>
+        </w:tabs>
+        <w:bidi w:val="0"/>
+        <w:ind w:left="709" w:hanging="283"/>
+        <w:jc w:val="left"/>
+        <w:rPr/>
+      </w:pPr>
+      <w:r>
+        <w:rPr>
+          <w:rStyle w:val="Strong"/>
+        </w:rPr>
+        <w:t>Auditoría externa</w:t>
+      </w:r>
+      <w:r>
+        <w:rPr/>
+        <w:t xml:space="preserve"> por especialistas en PETs (meses 6 y 12)</w:t>
+      </w:r>
+    </w:p>
+    <w:p>
+      <w:pPr>
+        <w:pStyle w:val="Cuerpodetexto"/>
+        <w:numPr>
+          <w:ilvl w:val="0"/>
+          <w:numId w:val="2"/>
+        </w:numPr>
+        <w:tabs>
+          <w:tab w:val="left" w:pos="709" w:leader="none"/>
+        </w:tabs>
+        <w:bidi w:val="0"/>
+        <w:ind w:left="709" w:hanging="283"/>
+        <w:jc w:val="left"/>
+        <w:rPr/>
+      </w:pPr>
+      <w:r>
+        <w:rPr>
+          <w:rStyle w:val="Strong"/>
+        </w:rPr>
+        <w:t>Dataset de prueba público</w:t>
+      </w:r>
+      <w:r>
+        <w:rPr/>
+        <w:t xml:space="preserve"> para validación continua</w:t>
+      </w:r>
+    </w:p>
+    <w:p>
+      <w:pPr>
+        <w:pStyle w:val="Cuerpodetexto"/>
+        <w:numPr>
+          <w:ilvl w:val="0"/>
+          <w:numId w:val="2"/>
+        </w:numPr>
+        <w:tabs>
+          <w:tab w:val="left" w:pos="709" w:leader="none"/>
+        </w:tabs>
+        <w:bidi w:val="0"/>
+        <w:ind w:left="709" w:hanging="283"/>
+        <w:jc w:val="left"/>
+        <w:rPr/>
+      </w:pPr>
+      <w:r>
+        <w:rPr>
+          <w:rStyle w:val="Strong"/>
+        </w:rPr>
+        <w:t>Métricas cuantificables:</w:t>
+      </w:r>
+      <w:r>
+        <w:rPr/>
+        <w:t xml:space="preserve"> k-anonymity ≥10, l-diversity ≥3</w:t>
+      </w:r>
+    </w:p>
+    <w:p>
+      <w:pPr>
+        <w:pStyle w:val="Ttulo2"/>
+        <w:numPr>
+          <w:ilvl w:val="0"/>
+          <w:numId w:val="0"/>
+        </w:numPr>
+        <w:bidi w:val="0"/>
+        <w:spacing w:before="200" w:after="120"/>
+        <w:ind w:left="0" w:hanging="0"/>
+        <w:jc w:val="left"/>
+        <w:rPr/>
+      </w:pPr>
+      <w:r>
+        <w:rPr>
+          <w:rStyle w:val="Strong"/>
+          <w:b/>
+        </w:rPr>
+        <w:t>2. Riesgo: Overhead Computacional Inaceptable</w:t>
+      </w:r>
+    </w:p>
+    <w:p>
+      <w:pPr>
+        <w:pStyle w:val="Cuerpodetexto"/>
+        <w:bidi w:val="0"/>
+        <w:spacing w:lineRule="auto" w:line="276" w:before="0" w:after="140"/>
+        <w:jc w:val="left"/>
+        <w:rPr/>
+      </w:pPr>
+      <w:r>
+        <w:rPr>
+          <w:rStyle w:val="Strong"/>
+        </w:rPr>
+        <w:t>Descripción:</w:t>
+      </w:r>
+      <w:r>
+        <w:rPr/>
+        <w:t xml:space="preserve"> La capa ZK-Cog añade latencia excesiva (&gt;1s por evento).</w:t>
+      </w:r>
+    </w:p>
+    <w:p>
+      <w:pPr>
+        <w:pStyle w:val="Cuerpodetexto"/>
+        <w:numPr>
+          <w:ilvl w:val="0"/>
+          <w:numId w:val="3"/>
+        </w:numPr>
+        <w:tabs>
+          <w:tab w:val="left" w:pos="709" w:leader="none"/>
+        </w:tabs>
+        <w:bidi w:val="0"/>
+        <w:ind w:left="709" w:hanging="283"/>
+        <w:jc w:val="left"/>
+        <w:rPr/>
+      </w:pPr>
+      <w:r>
+        <w:rPr>
+          <w:rStyle w:val="Strong"/>
         </w:rPr>
         <w:t>Probabilidad:</w:t>
       </w:r>
       <w:r>
         <w:rPr/>
+        <w:t xml:space="preserve"> Alta</w:t>
+      </w:r>
+    </w:p>
+    <w:p>
+      <w:pPr>
+        <w:pStyle w:val="Cuerpodetexto"/>
+        <w:numPr>
+          <w:ilvl w:val="0"/>
+          <w:numId w:val="3"/>
+        </w:numPr>
+        <w:tabs>
+          <w:tab w:val="left" w:pos="709" w:leader="none"/>
+        </w:tabs>
+        <w:bidi w:val="0"/>
+        <w:ind w:left="709" w:hanging="283"/>
+        <w:jc w:val="left"/>
+        <w:rPr/>
+      </w:pPr>
+      <w:r>
+        <w:rPr>
+          <w:rStyle w:val="Strong"/>
+        </w:rPr>
+        <w:t>Impacto:</w:t>
+      </w:r>
+      <w:r>
+        <w:rPr/>
+        <w:t xml:space="preserve"> Alto</w:t>
+      </w:r>
+    </w:p>
+    <w:p>
+      <w:pPr>
+        <w:pStyle w:val="Cuerpodetexto"/>
+        <w:bidi w:val="0"/>
+        <w:spacing w:lineRule="auto" w:line="276" w:before="0" w:after="140"/>
+        <w:jc w:val="left"/>
+        <w:rPr/>
+      </w:pPr>
+      <w:r>
+        <w:rPr>
+          <w:rStyle w:val="Strong"/>
+        </w:rPr>
+        <w:t>Mitigaciones:</w:t>
+      </w:r>
+    </w:p>
+    <w:p>
+      <w:pPr>
+        <w:pStyle w:val="Cuerpodetexto"/>
+        <w:numPr>
+          <w:ilvl w:val="0"/>
+          <w:numId w:val="4"/>
+        </w:numPr>
+        <w:tabs>
+          <w:tab w:val="left" w:pos="709" w:leader="none"/>
+        </w:tabs>
+        <w:bidi w:val="0"/>
+        <w:ind w:left="709" w:hanging="283"/>
+        <w:jc w:val="left"/>
+        <w:rPr/>
+      </w:pPr>
+      <w:r>
+        <w:rPr>
+          <w:rStyle w:val="Strong"/>
+        </w:rPr>
+        <w:t>Benchmark temprano</w:t>
+      </w:r>
+      <w:r>
+        <w:rPr/>
+        <w:t xml:space="preserve"> (mes 3) con perfiling detallado</w:t>
+      </w:r>
+    </w:p>
+    <w:p>
+      <w:pPr>
+        <w:pStyle w:val="Cuerpodetexto"/>
+        <w:numPr>
+          <w:ilvl w:val="0"/>
+          <w:numId w:val="4"/>
+        </w:numPr>
+        <w:tabs>
+          <w:tab w:val="left" w:pos="709" w:leader="none"/>
+        </w:tabs>
+        <w:bidi w:val="0"/>
+        <w:ind w:left="709" w:hanging="283"/>
+        <w:jc w:val="left"/>
+        <w:rPr/>
+      </w:pPr>
+      <w:r>
+        <w:rPr>
+          <w:rStyle w:val="Strong"/>
+        </w:rPr>
+        <w:t>Arquitectura asíncrona</w:t>
+      </w:r>
+      <w:r>
+        <w:rPr/>
+        <w:t xml:space="preserve"> (Tokio runtime, colas prioritarias)</w:t>
+      </w:r>
+    </w:p>
+    <w:p>
+      <w:pPr>
+        <w:pStyle w:val="Cuerpodetexto"/>
+        <w:numPr>
+          <w:ilvl w:val="0"/>
+          <w:numId w:val="4"/>
+        </w:numPr>
+        <w:tabs>
+          <w:tab w:val="left" w:pos="709" w:leader="none"/>
+        </w:tabs>
+        <w:bidi w:val="0"/>
+        <w:ind w:left="709" w:hanging="283"/>
+        <w:jc w:val="left"/>
+        <w:rPr/>
+      </w:pPr>
+      <w:r>
+        <w:rPr>
+          <w:rStyle w:val="Strong"/>
+        </w:rPr>
+        <w:t>Cache agresivo</w:t>
+      </w:r>
+      <w:r>
+        <w:rPr/>
+        <w:t xml:space="preserve"> de contextos similares</w:t>
+      </w:r>
+    </w:p>
+    <w:p>
+      <w:pPr>
+        <w:pStyle w:val="Cuerpodetexto"/>
+        <w:numPr>
+          <w:ilvl w:val="0"/>
+          <w:numId w:val="4"/>
+        </w:numPr>
+        <w:tabs>
+          <w:tab w:val="left" w:pos="709" w:leader="none"/>
+        </w:tabs>
+        <w:bidi w:val="0"/>
+        <w:ind w:left="709" w:hanging="283"/>
+        <w:jc w:val="left"/>
+        <w:rPr/>
+      </w:pPr>
+      <w:r>
+        <w:rPr>
+          <w:rStyle w:val="Strong"/>
+        </w:rPr>
+        <w:t>Modo degradado</w:t>
+      </w:r>
+      <w:r>
+        <w:rPr/>
+        <w:t xml:space="preserve"> para dispositivos limitados</w:t>
+      </w:r>
+    </w:p>
+    <w:p>
+      <w:pPr>
+        <w:pStyle w:val="Ttulo2"/>
+        <w:numPr>
+          <w:ilvl w:val="0"/>
+          <w:numId w:val="0"/>
+        </w:numPr>
+        <w:bidi w:val="0"/>
+        <w:spacing w:before="200" w:after="120"/>
+        <w:ind w:left="0" w:hanging="0"/>
+        <w:jc w:val="left"/>
+        <w:rPr/>
+      </w:pPr>
+      <w:r>
+        <w:rPr>
+          <w:rStyle w:val="Strong"/>
+          <w:b/>
+        </w:rPr>
+        <w:t>3. Riesgo: Pérdida de Contexto Semántico</w:t>
+      </w:r>
+    </w:p>
+    <w:p>
+      <w:pPr>
+        <w:pStyle w:val="Cuerpodetexto"/>
+        <w:bidi w:val="0"/>
+        <w:spacing w:lineRule="auto" w:line="276" w:before="0" w:after="140"/>
+        <w:jc w:val="left"/>
+        <w:rPr/>
+      </w:pPr>
+      <w:r>
+        <w:rPr>
+          <w:rStyle w:val="Strong"/>
+        </w:rPr>
+        <w:t>Descripción:</w:t>
+      </w:r>
+      <w:r>
+        <w:rPr/>
+        <w:t xml:space="preserve"> La anonimización destruye significado crítico para modelos IA.</w:t>
+      </w:r>
+    </w:p>
+    <w:p>
+      <w:pPr>
+        <w:pStyle w:val="Cuerpodetexto"/>
+        <w:numPr>
+          <w:ilvl w:val="0"/>
+          <w:numId w:val="5"/>
+        </w:numPr>
+        <w:tabs>
+          <w:tab w:val="left" w:pos="709" w:leader="none"/>
+        </w:tabs>
+        <w:bidi w:val="0"/>
+        <w:ind w:left="709" w:hanging="283"/>
+        <w:jc w:val="left"/>
+        <w:rPr/>
+      </w:pPr>
+      <w:r>
+        <w:rPr>
+          <w:rStyle w:val="Strong"/>
+        </w:rPr>
+        <w:t>Probabilidad:</w:t>
+      </w:r>
+      <w:r>
+        <w:rPr/>
         <w:t xml:space="preserve"> Media</w:t>
       </w:r>
     </w:p>
@@ -95,10 +531,9 @@
         <w:pStyle w:val="Cuerpodetexto"/>
         <w:numPr>
           <w:ilvl w:val="0"/>
-          <w:numId w:val="2"/>
-        </w:numPr>
-        <w:tabs>
-          <w:tab w:val="clear" w:pos="709"/>
+          <w:numId w:val="5"/>
+        </w:numPr>
+        <w:tabs>
           <w:tab w:val="left" w:pos="709" w:leader="none"/>
         </w:tabs>
         <w:bidi w:val="0"/>
@@ -108,12 +543,223 @@
       </w:pPr>
       <w:r>
         <w:rPr>
-          <w:rStyle w:val="Destaquemayor"/>
+          <w:rStyle w:val="Strong"/>
         </w:rPr>
         <w:t>Impacto:</w:t>
       </w:r>
       <w:r>
         <w:rPr/>
+        <w:t xml:space="preserve"> Alto</w:t>
+      </w:r>
+    </w:p>
+    <w:p>
+      <w:pPr>
+        <w:pStyle w:val="Cuerpodetexto"/>
+        <w:bidi w:val="0"/>
+        <w:spacing w:lineRule="auto" w:line="276" w:before="0" w:after="140"/>
+        <w:jc w:val="left"/>
+        <w:rPr/>
+      </w:pPr>
+      <w:r>
+        <w:rPr>
+          <w:rStyle w:val="Strong"/>
+        </w:rPr>
+        <w:t>Mitigaciones:</w:t>
+      </w:r>
+    </w:p>
+    <w:p>
+      <w:pPr>
+        <w:pStyle w:val="Cuerpodetexto"/>
+        <w:numPr>
+          <w:ilvl w:val="0"/>
+          <w:numId w:val="6"/>
+        </w:numPr>
+        <w:tabs>
+          <w:tab w:val="left" w:pos="709" w:leader="none"/>
+        </w:tabs>
+        <w:bidi w:val="0"/>
+        <w:ind w:left="709" w:hanging="283"/>
+        <w:jc w:val="left"/>
+        <w:rPr/>
+      </w:pPr>
+      <w:r>
+        <w:rPr>
+          <w:rStyle w:val="Strong"/>
+        </w:rPr>
+        <w:t>Evaluación continua</w:t>
+      </w:r>
+      <w:r>
+        <w:rPr/>
+        <w:t xml:space="preserve"> con métricas BLEU/ROUGE</w:t>
+      </w:r>
+    </w:p>
+    <w:p>
+      <w:pPr>
+        <w:pStyle w:val="Cuerpodetexto"/>
+        <w:numPr>
+          <w:ilvl w:val="0"/>
+          <w:numId w:val="6"/>
+        </w:numPr>
+        <w:tabs>
+          <w:tab w:val="left" w:pos="709" w:leader="none"/>
+        </w:tabs>
+        <w:bidi w:val="0"/>
+        <w:ind w:left="709" w:hanging="283"/>
+        <w:jc w:val="left"/>
+        <w:rPr/>
+      </w:pPr>
+      <w:r>
+        <w:rPr>
+          <w:rStyle w:val="Strong"/>
+        </w:rPr>
+        <w:t>Múltiples niveles de granularidad</w:t>
+      </w:r>
+      <w:r>
+        <w:rPr/>
+        <w:t xml:space="preserve"> configurables</w:t>
+      </w:r>
+    </w:p>
+    <w:p>
+      <w:pPr>
+        <w:pStyle w:val="Cuerpodetexto"/>
+        <w:numPr>
+          <w:ilvl w:val="0"/>
+          <w:numId w:val="6"/>
+        </w:numPr>
+        <w:tabs>
+          <w:tab w:val="left" w:pos="709" w:leader="none"/>
+        </w:tabs>
+        <w:bidi w:val="0"/>
+        <w:ind w:left="709" w:hanging="283"/>
+        <w:jc w:val="left"/>
+        <w:rPr/>
+      </w:pPr>
+      <w:r>
+        <w:rPr>
+          <w:rStyle w:val="Strong"/>
+        </w:rPr>
+        <w:t>Feedback loop</w:t>
+      </w:r>
+      <w:r>
+        <w:rPr/>
+        <w:t xml:space="preserve"> de usuario para calibrar utilidad/privacidad</w:t>
+      </w:r>
+    </w:p>
+    <w:p>
+      <w:pPr>
+        <w:pStyle w:val="Cuerpodetexto"/>
+        <w:numPr>
+          <w:ilvl w:val="0"/>
+          <w:numId w:val="6"/>
+        </w:numPr>
+        <w:tabs>
+          <w:tab w:val="left" w:pos="709" w:leader="none"/>
+        </w:tabs>
+        <w:bidi w:val="0"/>
+        <w:ind w:left="709" w:hanging="283"/>
+        <w:jc w:val="left"/>
+        <w:rPr/>
+      </w:pPr>
+      <w:r>
+        <w:rPr>
+          <w:rStyle w:val="Strong"/>
+        </w:rPr>
+        <w:t>Balance dinámico</w:t>
+      </w:r>
+      <w:r>
+        <w:rPr/>
+        <w:t xml:space="preserve"> mediante slider configurable</w:t>
+      </w:r>
+    </w:p>
+    <w:p>
+      <w:pPr>
+        <w:pStyle w:val="Ttulo2"/>
+        <w:numPr>
+          <w:ilvl w:val="0"/>
+          <w:numId w:val="0"/>
+        </w:numPr>
+        <w:bidi w:val="0"/>
+        <w:spacing w:before="200" w:after="120"/>
+        <w:ind w:left="0" w:hanging="0"/>
+        <w:jc w:val="left"/>
+        <w:rPr/>
+      </w:pPr>
+      <w:r>
+        <w:rPr>
+          <w:rStyle w:val="Strong"/>
+          <w:b/>
+        </w:rPr>
+        <w:t>4. Riesgo: Vulnerabilidades de Seguridad</w:t>
+      </w:r>
+    </w:p>
+    <w:p>
+      <w:pPr>
+        <w:pStyle w:val="Cuerpodetexto"/>
+        <w:bidi w:val="0"/>
+        <w:spacing w:lineRule="auto" w:line="276" w:before="0" w:after="140"/>
+        <w:jc w:val="left"/>
+        <w:rPr/>
+      </w:pPr>
+      <w:r>
+        <w:rPr>
+          <w:rStyle w:val="Strong"/>
+        </w:rPr>
+        <w:t>Descripción:</w:t>
+      </w:r>
+      <w:r>
+        <w:rPr/>
+        <w:t xml:space="preserve"> Ataques a componentes individuales comprometen el sistema.</w:t>
+      </w:r>
+    </w:p>
+    <w:p>
+      <w:pPr>
+        <w:pStyle w:val="Cuerpodetexto"/>
+        <w:numPr>
+          <w:ilvl w:val="0"/>
+          <w:numId w:val="7"/>
+        </w:numPr>
+        <w:tabs>
+          <w:tab w:val="left" w:pos="709" w:leader="none"/>
+        </w:tabs>
+        <w:bidi w:val="0"/>
+        <w:ind w:left="709" w:hanging="283"/>
+        <w:jc w:val="left"/>
+        <w:rPr/>
+      </w:pPr>
+      <w:r>
+        <w:rPr>
+          <w:rStyle w:val="Strong"/>
+        </w:rPr>
+        <w:t>Probabilidad:</w:t>
+      </w:r>
+      <w:r>
+        <w:rPr/>
+        <w:t xml:space="preserve"> Media-Alta</w:t>
+      </w:r>
+    </w:p>
+    <w:p>
+      <w:pPr>
+        <w:pStyle w:val="Cuerpodetexto"/>
+        <w:numPr>
+          <w:ilvl w:val="0"/>
+          <w:numId w:val="7"/>
+        </w:numPr>
+        <w:tabs>
+          <w:tab w:val="left" w:pos="709" w:leader="none"/>
+        </w:tabs>
+        <w:bidi w:val="0"/>
+        <w:ind w:left="709" w:hanging="283"/>
+        <w:jc w:val="left"/>
+        <w:rPr/>
+      </w:pPr>
+      <w:r>
+        <w:rPr>
+          <w:rStyle w:val="Strong"/>
+        </w:rPr>
+        <w:t>Impacto:</w:t>
+      </w:r>
+      <w:r>
+        <w:rPr/>
         <w:t xml:space="preserve"> Crítico</w:t>
       </w:r>
     </w:p>
@@ -127,7 +773,7 @@
       </w:pPr>
       <w:r>
         <w:rPr>
-          <w:rStyle w:val="Destaquemayor"/>
+          <w:rStyle w:val="Strong"/>
         </w:rPr>
         <w:t>Mitigaciones:</w:t>
       </w:r>
@@ -137,10 +783,9 @@
         <w:pStyle w:val="Cuerpodetexto"/>
         <w:numPr>
           <w:ilvl w:val="0"/>
-          <w:numId w:val="3"/>
-        </w:numPr>
-        <w:tabs>
-          <w:tab w:val="clear" w:pos="709"/>
+          <w:numId w:val="8"/>
+        </w:numPr>
+        <w:tabs>
           <w:tab w:val="left" w:pos="709" w:leader="none"/>
         </w:tabs>
         <w:bidi w:val="0"/>
@@ -149,29 +794,24 @@
         <w:rPr/>
       </w:pPr>
       <w:r>
-        <w:rPr/>
-        <w:t xml:space="preserve">Implementar </w:t>
-      </w:r>
-      <w:r>
-        <w:rPr>
-          <w:rStyle w:val="Destaquemayor"/>
-        </w:rPr>
-        <w:t>Private Differential Privacy</w:t>
-      </w:r>
-      <w:r>
-        <w:rPr/>
-        <w:t xml:space="preserve"> en capa semántica (ε≤1.0)</w:t>
-      </w:r>
-    </w:p>
-    <w:p>
-      <w:pPr>
-        <w:pStyle w:val="Cuerpodetexto"/>
-        <w:numPr>
-          <w:ilvl w:val="0"/>
-          <w:numId w:val="3"/>
-        </w:numPr>
-        <w:tabs>
-          <w:tab w:val="clear" w:pos="709"/>
+        <w:rPr>
+          <w:rStyle w:val="Strong"/>
+        </w:rPr>
+        <w:t>Sandboxing por componente</w:t>
+      </w:r>
+      <w:r>
+        <w:rPr/>
+        <w:t xml:space="preserve"> (gVisor/Firecracker)</w:t>
+      </w:r>
+    </w:p>
+    <w:p>
+      <w:pPr>
+        <w:pStyle w:val="Cuerpodetexto"/>
+        <w:numPr>
+          <w:ilvl w:val="0"/>
+          <w:numId w:val="8"/>
+        </w:numPr>
+        <w:tabs>
           <w:tab w:val="left" w:pos="709" w:leader="none"/>
         </w:tabs>
         <w:bidi w:val="0"/>
@@ -181,24 +821,23 @@
       </w:pPr>
       <w:r>
         <w:rPr>
-          <w:rStyle w:val="Destaquemayor"/>
-        </w:rPr>
-        <w:t>Auditoría externa</w:t>
-      </w:r>
-      <w:r>
-        <w:rPr/>
-        <w:t xml:space="preserve"> por especialistas en PETs (meses 6 y 12)</w:t>
-      </w:r>
-    </w:p>
-    <w:p>
-      <w:pPr>
-        <w:pStyle w:val="Cuerpodetexto"/>
-        <w:numPr>
-          <w:ilvl w:val="0"/>
-          <w:numId w:val="3"/>
-        </w:numPr>
-        <w:tabs>
-          <w:tab w:val="clear" w:pos="709"/>
+          <w:rStyle w:val="Strong"/>
+        </w:rPr>
+        <w:t>Cifrado end-to-end</w:t>
+      </w:r>
+      <w:r>
+        <w:rPr/>
+        <w:t xml:space="preserve"> (AES-256-GCM)</w:t>
+      </w:r>
+    </w:p>
+    <w:p>
+      <w:pPr>
+        <w:pStyle w:val="Cuerpodetexto"/>
+        <w:numPr>
+          <w:ilvl w:val="0"/>
+          <w:numId w:val="8"/>
+        </w:numPr>
+        <w:tabs>
           <w:tab w:val="left" w:pos="709" w:leader="none"/>
         </w:tabs>
         <w:bidi w:val="0"/>
@@ -208,24 +847,23 @@
       </w:pPr>
       <w:r>
         <w:rPr>
-          <w:rStyle w:val="Destaquemayor"/>
-        </w:rPr>
-        <w:t>Dataset de prueba público</w:t>
-      </w:r>
-      <w:r>
-        <w:rPr/>
-        <w:t xml:space="preserve"> para validación continua</w:t>
-      </w:r>
-    </w:p>
-    <w:p>
-      <w:pPr>
-        <w:pStyle w:val="Cuerpodetexto"/>
-        <w:numPr>
-          <w:ilvl w:val="0"/>
-          <w:numId w:val="3"/>
-        </w:numPr>
-        <w:tabs>
-          <w:tab w:val="clear" w:pos="709"/>
+          <w:rStyle w:val="Strong"/>
+        </w:rPr>
+        <w:t>Verificación de integridad</w:t>
+      </w:r>
+      <w:r>
+        <w:rPr/>
+        <w:t xml:space="preserve"> (secure boot/TPM)</w:t>
+      </w:r>
+    </w:p>
+    <w:p>
+      <w:pPr>
+        <w:pStyle w:val="Cuerpodetexto"/>
+        <w:numPr>
+          <w:ilvl w:val="0"/>
+          <w:numId w:val="8"/>
+        </w:numPr>
+        <w:tabs>
           <w:tab w:val="left" w:pos="709" w:leader="none"/>
         </w:tabs>
         <w:bidi w:val="0"/>
@@ -235,13 +873,29 @@
       </w:pPr>
       <w:r>
         <w:rPr>
-          <w:rStyle w:val="Destaquemayor"/>
-        </w:rPr>
-        <w:t>Métricas cuantificables:</w:t>
-      </w:r>
-      <w:r>
-        <w:rPr/>
-        <w:t xml:space="preserve"> k-anonymity ≥10, l-diversity ≥3</w:t>
+          <w:rStyle w:val="Strong"/>
+        </w:rPr>
+        <w:t>Pentesting programado</w:t>
+      </w:r>
+      <w:r>
+        <w:rPr/>
+        <w:t xml:space="preserve"> cada 6 meses</w:t>
+      </w:r>
+    </w:p>
+    <w:p>
+      <w:pPr>
+        <w:pStyle w:val="Cuerpodetexto"/>
+        <w:numPr>
+          <w:ilvl w:val="0"/>
+          <w:numId w:val="0"/>
+        </w:numPr>
+        <w:bidi w:val="0"/>
+        <w:ind w:left="0" w:hanging="0"/>
+        <w:jc w:val="left"/>
+        <w:rPr/>
+      </w:pPr>
+      <w:r>
+        <w:rPr/>
       </w:r>
     </w:p>
     <w:p>
@@ -253,15 +907,16 @@
         </w:numPr>
         <w:bidi w:val="0"/>
         <w:spacing w:before="200" w:after="120"/>
-        <w:jc w:val="left"/>
-        <w:rPr/>
-      </w:pPr>
-      <w:r>
-        <w:rPr>
-          <w:rStyle w:val="Destaquemayor"/>
+        <w:ind w:left="0" w:hanging="0"/>
+        <w:jc w:val="left"/>
+        <w:rPr/>
+      </w:pPr>
+      <w:r>
+        <w:rPr>
+          <w:rStyle w:val="Strong"/>
           <w:b/>
         </w:rPr>
-        <w:t>2. Riesgo: Overhead Computacional Inaceptable</w:t>
+        <w:t>5. Riesgo: Incompatibilidad con Modelos Específicos</w:t>
       </w:r>
     </w:p>
     <w:p>
@@ -274,24 +929,23 @@
       </w:pPr>
       <w:r>
         <w:rPr>
-          <w:rStyle w:val="Destaquemayor"/>
+          <w:rStyle w:val="Strong"/>
         </w:rPr>
         <w:t>Descripción:</w:t>
       </w:r>
       <w:r>
         <w:rPr/>
-        <w:t xml:space="preserve"> La capa ZK-Cog añade latencia excesiva (&gt;1s por evento).</w:t>
-      </w:r>
-    </w:p>
-    <w:p>
-      <w:pPr>
-        <w:pStyle w:val="Cuerpodetexto"/>
-        <w:numPr>
-          <w:ilvl w:val="0"/>
-          <w:numId w:val="4"/>
-        </w:numPr>
-        <w:tabs>
-          <w:tab w:val="clear" w:pos="709"/>
+        <w:t xml:space="preserve"> Algunos modelos no pueden consumir formato UMCI efectivamente.</w:t>
+      </w:r>
+    </w:p>
+    <w:p>
+      <w:pPr>
+        <w:pStyle w:val="Cuerpodetexto"/>
+        <w:numPr>
+          <w:ilvl w:val="0"/>
+          <w:numId w:val="9"/>
+        </w:numPr>
+        <w:tabs>
           <w:tab w:val="left" w:pos="709" w:leader="none"/>
         </w:tabs>
         <w:bidi w:val="0"/>
@@ -301,12 +955,235 @@
       </w:pPr>
       <w:r>
         <w:rPr>
-          <w:rStyle w:val="Destaquemayor"/>
+          <w:rStyle w:val="Strong"/>
         </w:rPr>
         <w:t>Probabilidad:</w:t>
       </w:r>
       <w:r>
         <w:rPr/>
+        <w:t xml:space="preserve"> Baja-Media</w:t>
+      </w:r>
+    </w:p>
+    <w:p>
+      <w:pPr>
+        <w:pStyle w:val="Cuerpodetexto"/>
+        <w:numPr>
+          <w:ilvl w:val="0"/>
+          <w:numId w:val="9"/>
+        </w:numPr>
+        <w:tabs>
+          <w:tab w:val="left" w:pos="709" w:leader="none"/>
+        </w:tabs>
+        <w:bidi w:val="0"/>
+        <w:ind w:left="709" w:hanging="283"/>
+        <w:jc w:val="left"/>
+        <w:rPr/>
+      </w:pPr>
+      <w:r>
+        <w:rPr>
+          <w:rStyle w:val="Strong"/>
+        </w:rPr>
+        <w:t>Impacto:</w:t>
+      </w:r>
+      <w:r>
+        <w:rPr/>
+        <w:t xml:space="preserve"> Medio</w:t>
+      </w:r>
+    </w:p>
+    <w:p>
+      <w:pPr>
+        <w:pStyle w:val="Cuerpodetexto"/>
+        <w:bidi w:val="0"/>
+        <w:spacing w:lineRule="auto" w:line="276" w:before="0" w:after="140"/>
+        <w:jc w:val="left"/>
+        <w:rPr/>
+      </w:pPr>
+      <w:r>
+        <w:rPr>
+          <w:rStyle w:val="Strong"/>
+        </w:rPr>
+        <w:t>Mitigaciones:</w:t>
+      </w:r>
+    </w:p>
+    <w:p>
+      <w:pPr>
+        <w:pStyle w:val="Cuerpodetexto"/>
+        <w:numPr>
+          <w:ilvl w:val="0"/>
+          <w:numId w:val="10"/>
+        </w:numPr>
+        <w:tabs>
+          <w:tab w:val="left" w:pos="709" w:leader="none"/>
+        </w:tabs>
+        <w:bidi w:val="0"/>
+        <w:ind w:left="709" w:hanging="283"/>
+        <w:jc w:val="left"/>
+        <w:rPr/>
+      </w:pPr>
+      <w:r>
+        <w:rPr>
+          <w:rStyle w:val="Strong"/>
+        </w:rPr>
+        <w:t>Suite de compatibilidad</w:t>
+      </w:r>
+      <w:r>
+        <w:rPr/>
+        <w:t xml:space="preserve"> con 10+ modelos populares</w:t>
+      </w:r>
+    </w:p>
+    <w:p>
+      <w:pPr>
+        <w:pStyle w:val="Cuerpodetexto"/>
+        <w:numPr>
+          <w:ilvl w:val="0"/>
+          <w:numId w:val="10"/>
+        </w:numPr>
+        <w:tabs>
+          <w:tab w:val="left" w:pos="709" w:leader="none"/>
+        </w:tabs>
+        <w:bidi w:val="0"/>
+        <w:ind w:left="709" w:hanging="283"/>
+        <w:jc w:val="left"/>
+        <w:rPr/>
+      </w:pPr>
+      <w:r>
+        <w:rPr>
+          <w:rStyle w:val="Strong"/>
+        </w:rPr>
+        <w:t>Adaptadores específicos</w:t>
+      </w:r>
+      <w:r>
+        <w:rPr/>
+        <w:t xml:space="preserve"> para casos problemáticos</w:t>
+      </w:r>
+    </w:p>
+    <w:p>
+      <w:pPr>
+        <w:pStyle w:val="Cuerpodetexto"/>
+        <w:numPr>
+          <w:ilvl w:val="0"/>
+          <w:numId w:val="10"/>
+        </w:numPr>
+        <w:tabs>
+          <w:tab w:val="left" w:pos="709" w:leader="none"/>
+        </w:tabs>
+        <w:bidi w:val="0"/>
+        <w:ind w:left="709" w:hanging="283"/>
+        <w:jc w:val="left"/>
+        <w:rPr/>
+      </w:pPr>
+      <w:r>
+        <w:rPr>
+          <w:rStyle w:val="Strong"/>
+        </w:rPr>
+        <w:t>Formato alternativo JSON-LD</w:t>
+      </w:r>
+    </w:p>
+    <w:p>
+      <w:pPr>
+        <w:pStyle w:val="Cuerpodetexto"/>
+        <w:numPr>
+          <w:ilvl w:val="0"/>
+          <w:numId w:val="10"/>
+        </w:numPr>
+        <w:tabs>
+          <w:tab w:val="left" w:pos="709" w:leader="none"/>
+        </w:tabs>
+        <w:bidi w:val="0"/>
+        <w:ind w:left="709" w:hanging="283"/>
+        <w:jc w:val="left"/>
+        <w:rPr/>
+      </w:pPr>
+      <w:r>
+        <w:rPr>
+          <w:rStyle w:val="Strong"/>
+        </w:rPr>
+        <w:t>Documentación clara</w:t>
+      </w:r>
+      <w:r>
+        <w:rPr/>
+        <w:t xml:space="preserve"> de requerimientos</w:t>
+      </w:r>
+    </w:p>
+    <w:p>
+      <w:pPr>
+        <w:pStyle w:val="Cuerpodetexto"/>
+        <w:numPr>
+          <w:ilvl w:val="0"/>
+          <w:numId w:val="0"/>
+        </w:numPr>
+        <w:bidi w:val="0"/>
+        <w:ind w:left="0" w:hanging="0"/>
+        <w:jc w:val="left"/>
+        <w:rPr/>
+      </w:pPr>
+      <w:r>
+        <w:rPr/>
+      </w:r>
+    </w:p>
+    <w:p>
+      <w:pPr>
+        <w:pStyle w:val="Ttulo2"/>
+        <w:numPr>
+          <w:ilvl w:val="0"/>
+          <w:numId w:val="0"/>
+        </w:numPr>
+        <w:bidi w:val="0"/>
+        <w:spacing w:before="200" w:after="120"/>
+        <w:ind w:left="0" w:hanging="0"/>
+        <w:jc w:val="left"/>
+        <w:rPr/>
+      </w:pPr>
+      <w:r>
+        <w:rPr>
+          <w:rStyle w:val="Strong"/>
+          <w:b/>
+        </w:rPr>
+        <w:t>6. Riesgo: Fragilidad del UMCI Listener</w:t>
+      </w:r>
+    </w:p>
+    <w:p>
+      <w:pPr>
+        <w:pStyle w:val="Cuerpodetexto"/>
+        <w:bidi w:val="0"/>
+        <w:spacing w:lineRule="auto" w:line="276" w:before="0" w:after="140"/>
+        <w:jc w:val="left"/>
+        <w:rPr/>
+      </w:pPr>
+      <w:r>
+        <w:rPr>
+          <w:rStyle w:val="Strong"/>
+        </w:rPr>
+        <w:t>Descripción:</w:t>
+      </w:r>
+      <w:r>
+        <w:rPr/>
+        <w:t xml:space="preserve"> Monitor de archivos pierde eventos o causa alto consumo.</w:t>
+      </w:r>
+    </w:p>
+    <w:p>
+      <w:pPr>
+        <w:pStyle w:val="Cuerpodetexto"/>
+        <w:numPr>
+          <w:ilvl w:val="0"/>
+          <w:numId w:val="11"/>
+        </w:numPr>
+        <w:tabs>
+          <w:tab w:val="left" w:pos="709" w:leader="none"/>
+        </w:tabs>
+        <w:bidi w:val="0"/>
+        <w:ind w:left="709" w:hanging="283"/>
+        <w:jc w:val="left"/>
+        <w:rPr/>
+      </w:pPr>
+      <w:r>
+        <w:rPr>
+          <w:rStyle w:val="Strong"/>
+        </w:rPr>
+        <w:t>Probabilidad:</w:t>
+      </w:r>
+      <w:r>
+        <w:rPr/>
         <w:t xml:space="preserve"> Alta</w:t>
       </w:r>
     </w:p>
@@ -315,10 +1192,9 @@
         <w:pStyle w:val="Cuerpodetexto"/>
         <w:numPr>
           <w:ilvl w:val="0"/>
-          <w:numId w:val="4"/>
-        </w:numPr>
-        <w:tabs>
-          <w:tab w:val="clear" w:pos="709"/>
+          <w:numId w:val="11"/>
+        </w:numPr>
+        <w:tabs>
           <w:tab w:val="left" w:pos="709" w:leader="none"/>
         </w:tabs>
         <w:bidi w:val="0"/>
@@ -328,13 +1204,13 @@
       </w:pPr>
       <w:r>
         <w:rPr>
-          <w:rStyle w:val="Destaquemayor"/>
+          <w:rStyle w:val="Strong"/>
         </w:rPr>
         <w:t>Impacto:</w:t>
       </w:r>
       <w:r>
         <w:rPr/>
-        <w:t xml:space="preserve"> Alto</w:t>
+        <w:t xml:space="preserve"> Medio</w:t>
       </w:r>
     </w:p>
     <w:p>
@@ -347,7 +1223,7 @@
       </w:pPr>
       <w:r>
         <w:rPr>
-          <w:rStyle w:val="Destaquemayor"/>
+          <w:rStyle w:val="Strong"/>
         </w:rPr>
         <w:t>Mitigaciones:</w:t>
       </w:r>
@@ -357,10 +1233,9 @@
         <w:pStyle w:val="Cuerpodetexto"/>
         <w:numPr>
           <w:ilvl w:val="0"/>
-          <w:numId w:val="5"/>
-        </w:numPr>
-        <w:tabs>
-          <w:tab w:val="clear" w:pos="709"/>
+          <w:numId w:val="12"/>
+        </w:numPr>
+        <w:tabs>
           <w:tab w:val="left" w:pos="709" w:leader="none"/>
         </w:tabs>
         <w:bidi w:val="0"/>
@@ -370,24 +1245,23 @@
       </w:pPr>
       <w:r>
         <w:rPr>
-          <w:rStyle w:val="Destaquemayor"/>
-        </w:rPr>
-        <w:t>Benchmark temprano</w:t>
-      </w:r>
-      <w:r>
-        <w:rPr/>
-        <w:t xml:space="preserve"> (mes 3) con perfiling detallado</w:t>
-      </w:r>
-    </w:p>
-    <w:p>
-      <w:pPr>
-        <w:pStyle w:val="Cuerpodetexto"/>
-        <w:numPr>
-          <w:ilvl w:val="0"/>
-          <w:numId w:val="5"/>
-        </w:numPr>
-        <w:tabs>
-          <w:tab w:val="clear" w:pos="709"/>
+          <w:rStyle w:val="Strong"/>
+        </w:rPr>
+        <w:t>Múltiples backends</w:t>
+      </w:r>
+      <w:r>
+        <w:rPr/>
+        <w:t xml:space="preserve"> + fallback polling</w:t>
+      </w:r>
+    </w:p>
+    <w:p>
+      <w:pPr>
+        <w:pStyle w:val="Cuerpodetexto"/>
+        <w:numPr>
+          <w:ilvl w:val="0"/>
+          <w:numId w:val="12"/>
+        </w:numPr>
+        <w:tabs>
           <w:tab w:val="left" w:pos="709" w:leader="none"/>
         </w:tabs>
         <w:bidi w:val="0"/>
@@ -397,24 +1271,23 @@
       </w:pPr>
       <w:r>
         <w:rPr>
-          <w:rStyle w:val="Destaquemayor"/>
-        </w:rPr>
-        <w:t>Arquitectura asíncrona</w:t>
-      </w:r>
-      <w:r>
-        <w:rPr/>
-        <w:t xml:space="preserve"> (Tokio runtime, colas prioritarias)</w:t>
-      </w:r>
-    </w:p>
-    <w:p>
-      <w:pPr>
-        <w:pStyle w:val="Cuerpodetexto"/>
-        <w:numPr>
-          <w:ilvl w:val="0"/>
-          <w:numId w:val="5"/>
-        </w:numPr>
-        <w:tabs>
-          <w:tab w:val="clear" w:pos="709"/>
+          <w:rStyle w:val="Strong"/>
+        </w:rPr>
+        <w:t>Límites de rate-limiting</w:t>
+      </w:r>
+      <w:r>
+        <w:rPr/>
+        <w:t xml:space="preserve"> configurables</w:t>
+      </w:r>
+    </w:p>
+    <w:p>
+      <w:pPr>
+        <w:pStyle w:val="Cuerpodetexto"/>
+        <w:numPr>
+          <w:ilvl w:val="0"/>
+          <w:numId w:val="12"/>
+        </w:numPr>
+        <w:tabs>
           <w:tab w:val="left" w:pos="709" w:leader="none"/>
         </w:tabs>
         <w:bidi w:val="0"/>
@@ -424,24 +1297,23 @@
       </w:pPr>
       <w:r>
         <w:rPr>
-          <w:rStyle w:val="Destaquemayor"/>
-        </w:rPr>
-        <w:t>Cache agresivo</w:t>
-      </w:r>
-      <w:r>
-        <w:rPr/>
-        <w:t xml:space="preserve"> de contextos similares</w:t>
-      </w:r>
-    </w:p>
-    <w:p>
-      <w:pPr>
-        <w:pStyle w:val="Cuerpodetexto"/>
-        <w:numPr>
-          <w:ilvl w:val="0"/>
-          <w:numId w:val="5"/>
-        </w:numPr>
-        <w:tabs>
-          <w:tab w:val="clear" w:pos="709"/>
+          <w:rStyle w:val="Strong"/>
+        </w:rPr>
+        <w:t>Modo "batch processing"</w:t>
+      </w:r>
+      <w:r>
+        <w:rPr/>
+        <w:t xml:space="preserve"> para sistemas activos</w:t>
+      </w:r>
+    </w:p>
+    <w:p>
+      <w:pPr>
+        <w:pStyle w:val="Cuerpodetexto"/>
+        <w:numPr>
+          <w:ilvl w:val="0"/>
+          <w:numId w:val="12"/>
+        </w:numPr>
+        <w:tabs>
           <w:tab w:val="left" w:pos="709" w:leader="none"/>
         </w:tabs>
         <w:bidi w:val="0"/>
@@ -451,13 +1323,23 @@
       </w:pPr>
       <w:r>
         <w:rPr>
-          <w:rStyle w:val="Destaquemayor"/>
-        </w:rPr>
-        <w:t>Modo degradado</w:t>
-      </w:r>
-      <w:r>
-        <w:rPr/>
-        <w:t xml:space="preserve"> para dispositivos limitados</w:t>
+          <w:rStyle w:val="Strong"/>
+        </w:rPr>
+        <w:t>Health checks automáticos</w:t>
+      </w:r>
+    </w:p>
+    <w:p>
+      <w:pPr>
+        <w:pStyle w:val="Cuerpodetexto"/>
+        <w:bidi w:val="0"/>
+        <w:spacing w:lineRule="auto" w:line="276" w:before="0" w:after="140"/>
+        <w:jc w:val="left"/>
+        <w:rPr>
+          <w:rStyle w:val="Strong"/>
+        </w:rPr>
+      </w:pPr>
+      <w:r>
+        <w:rPr/>
       </w:r>
     </w:p>
     <w:p>
@@ -469,15 +1351,16 @@
         </w:numPr>
         <w:bidi w:val="0"/>
         <w:spacing w:before="200" w:after="120"/>
-        <w:jc w:val="left"/>
-        <w:rPr/>
-      </w:pPr>
-      <w:r>
-        <w:rPr>
-          <w:rStyle w:val="Destaquemayor"/>
+        <w:ind w:left="0" w:hanging="0"/>
+        <w:jc w:val="left"/>
+        <w:rPr/>
+      </w:pPr>
+      <w:r>
+        <w:rPr>
+          <w:rStyle w:val="Strong"/>
           <w:b/>
         </w:rPr>
-        <w:t>3. Riesgo: Pérdida de Contexto Semántico</w:t>
+        <w:t>7. Riesgo: Complejidad de Despliegue Empresarial</w:t>
       </w:r>
     </w:p>
     <w:p>
@@ -490,24 +1373,23 @@
       </w:pPr>
       <w:r>
         <w:rPr>
-          <w:rStyle w:val="Destaquemayor"/>
+          <w:rStyle w:val="Strong"/>
         </w:rPr>
         <w:t>Descripción:</w:t>
       </w:r>
       <w:r>
         <w:rPr/>
-        <w:t xml:space="preserve"> La anonimización destruye significado crítico para modelos IA.</w:t>
-      </w:r>
-    </w:p>
-    <w:p>
-      <w:pPr>
-        <w:pStyle w:val="Cuerpodetexto"/>
-        <w:numPr>
-          <w:ilvl w:val="0"/>
-          <w:numId w:val="6"/>
-        </w:numPr>
-        <w:tabs>
-          <w:tab w:val="clear" w:pos="709"/>
+        <w:t xml:space="preserve"> Dificultad de integración en entornos existentes.</w:t>
+      </w:r>
+    </w:p>
+    <w:p>
+      <w:pPr>
+        <w:pStyle w:val="Cuerpodetexto"/>
+        <w:numPr>
+          <w:ilvl w:val="0"/>
+          <w:numId w:val="13"/>
+        </w:numPr>
+        <w:tabs>
           <w:tab w:val="left" w:pos="709" w:leader="none"/>
         </w:tabs>
         <w:bidi w:val="0"/>
@@ -517,7 +1399,7 @@
       </w:pPr>
       <w:r>
         <w:rPr>
-          <w:rStyle w:val="Destaquemayor"/>
+          <w:rStyle w:val="Strong"/>
         </w:rPr>
         <w:t>Probabilidad:</w:t>
       </w:r>
@@ -531,10 +1413,9 @@
         <w:pStyle w:val="Cuerpodetexto"/>
         <w:numPr>
           <w:ilvl w:val="0"/>
-          <w:numId w:val="6"/>
-        </w:numPr>
-        <w:tabs>
-          <w:tab w:val="clear" w:pos="709"/>
+          <w:numId w:val="13"/>
+        </w:numPr>
+        <w:tabs>
           <w:tab w:val="left" w:pos="709" w:leader="none"/>
         </w:tabs>
         <w:bidi w:val="0"/>
@@ -544,13 +1425,13 @@
       </w:pPr>
       <w:r>
         <w:rPr>
-          <w:rStyle w:val="Destaquemayor"/>
+          <w:rStyle w:val="Strong"/>
         </w:rPr>
         <w:t>Impacto:</w:t>
       </w:r>
       <w:r>
         <w:rPr/>
-        <w:t xml:space="preserve"> Alto</w:t>
+        <w:t xml:space="preserve"> Medio</w:t>
       </w:r>
     </w:p>
     <w:p>
@@ -563,7 +1444,7 @@
       </w:pPr>
       <w:r>
         <w:rPr>
-          <w:rStyle w:val="Destaquemayor"/>
+          <w:rStyle w:val="Strong"/>
         </w:rPr>
         <w:t>Mitigaciones:</w:t>
       </w:r>
@@ -573,10 +1454,9 @@
         <w:pStyle w:val="Cuerpodetexto"/>
         <w:numPr>
           <w:ilvl w:val="0"/>
-          <w:numId w:val="7"/>
-        </w:numPr>
-        <w:tabs>
-          <w:tab w:val="clear" w:pos="709"/>
+          <w:numId w:val="14"/>
+        </w:numPr>
+        <w:tabs>
           <w:tab w:val="left" w:pos="709" w:leader="none"/>
         </w:tabs>
         <w:bidi w:val="0"/>
@@ -586,24 +1466,23 @@
       </w:pPr>
       <w:r>
         <w:rPr>
-          <w:rStyle w:val="Destaquemayor"/>
-        </w:rPr>
-        <w:t>Evaluación continua</w:t>
-      </w:r>
-      <w:r>
-        <w:rPr/>
-        <w:t xml:space="preserve"> con métricas BLEU/ROUGE</w:t>
-      </w:r>
-    </w:p>
-    <w:p>
-      <w:pPr>
-        <w:pStyle w:val="Cuerpodetexto"/>
-        <w:numPr>
-          <w:ilvl w:val="0"/>
-          <w:numId w:val="7"/>
-        </w:numPr>
-        <w:tabs>
-          <w:tab w:val="clear" w:pos="709"/>
+          <w:rStyle w:val="Strong"/>
+        </w:rPr>
+        <w:t>Containers Docker</w:t>
+      </w:r>
+      <w:r>
+        <w:rPr/>
+        <w:t xml:space="preserve"> pre-configurados</w:t>
+      </w:r>
+    </w:p>
+    <w:p>
+      <w:pPr>
+        <w:pStyle w:val="Cuerpodetexto"/>
+        <w:numPr>
+          <w:ilvl w:val="0"/>
+          <w:numId w:val="14"/>
+        </w:numPr>
+        <w:tabs>
           <w:tab w:val="left" w:pos="709" w:leader="none"/>
         </w:tabs>
         <w:bidi w:val="0"/>
@@ -613,24 +1492,23 @@
       </w:pPr>
       <w:r>
         <w:rPr>
-          <w:rStyle w:val="Destaquemayor"/>
-        </w:rPr>
-        <w:t>Múltiples niveles de granularidad</w:t>
-      </w:r>
-      <w:r>
-        <w:rPr/>
-        <w:t xml:space="preserve"> configurables</w:t>
-      </w:r>
-    </w:p>
-    <w:p>
-      <w:pPr>
-        <w:pStyle w:val="Cuerpodetexto"/>
-        <w:numPr>
-          <w:ilvl w:val="0"/>
-          <w:numId w:val="7"/>
-        </w:numPr>
-        <w:tabs>
-          <w:tab w:val="clear" w:pos="709"/>
+          <w:rStyle w:val="Strong"/>
+        </w:rPr>
+        <w:t>Helm charts</w:t>
+      </w:r>
+      <w:r>
+        <w:rPr/>
+        <w:t xml:space="preserve"> para Kubernetes</w:t>
+      </w:r>
+    </w:p>
+    <w:p>
+      <w:pPr>
+        <w:pStyle w:val="Cuerpodetexto"/>
+        <w:numPr>
+          <w:ilvl w:val="0"/>
+          <w:numId w:val="14"/>
+        </w:numPr>
+        <w:tabs>
           <w:tab w:val="left" w:pos="709" w:leader="none"/>
         </w:tabs>
         <w:bidi w:val="0"/>
@@ -640,24 +1518,23 @@
       </w:pPr>
       <w:r>
         <w:rPr>
-          <w:rStyle w:val="Destaquemayor"/>
-        </w:rPr>
-        <w:t>Feedback loop</w:t>
-      </w:r>
-      <w:r>
-        <w:rPr/>
-        <w:t xml:space="preserve"> de usuario para calibrar utilidad/privacidad</w:t>
-      </w:r>
-    </w:p>
-    <w:p>
-      <w:pPr>
-        <w:pStyle w:val="Cuerpodetexto"/>
-        <w:numPr>
-          <w:ilvl w:val="0"/>
-          <w:numId w:val="7"/>
-        </w:numPr>
-        <w:tabs>
-          <w:tab w:val="clear" w:pos="709"/>
+          <w:rStyle w:val="Strong"/>
+        </w:rPr>
+        <w:t>Guías de despliegue</w:t>
+      </w:r>
+      <w:r>
+        <w:rPr/>
+        <w:t xml:space="preserve"> para entornos comunes</w:t>
+      </w:r>
+    </w:p>
+    <w:p>
+      <w:pPr>
+        <w:pStyle w:val="Cuerpodetexto"/>
+        <w:numPr>
+          <w:ilvl w:val="0"/>
+          <w:numId w:val="14"/>
+        </w:numPr>
+        <w:tabs>
           <w:tab w:val="left" w:pos="709" w:leader="none"/>
         </w:tabs>
         <w:bidi w:val="0"/>
@@ -667,909 +1544,7 @@
       </w:pPr>
       <w:r>
         <w:rPr>
-          <w:rStyle w:val="Destaquemayor"/>
-        </w:rPr>
-        <w:t>Balance dinámico</w:t>
-      </w:r>
-      <w:r>
-        <w:rPr/>
-        <w:t xml:space="preserve"> mediante slider configurable</w:t>
-      </w:r>
-    </w:p>
-    <w:p>
-      <w:pPr>
-        <w:pStyle w:val="Ttulo2"/>
-        <w:numPr>
-          <w:ilvl w:val="0"/>
-          <w:numId w:val="0"/>
-        </w:numPr>
-        <w:bidi w:val="0"/>
-        <w:spacing w:before="200" w:after="120"/>
-        <w:jc w:val="left"/>
-        <w:rPr/>
-      </w:pPr>
-      <w:r>
-        <w:rPr>
-          <w:rStyle w:val="Destaquemayor"/>
-          <w:b/>
-        </w:rPr>
-        <w:t>4. Riesgo: Vulnerabilidades de Seguridad</w:t>
-      </w:r>
-    </w:p>
-    <w:p>
-      <w:pPr>
-        <w:pStyle w:val="Cuerpodetexto"/>
-        <w:bidi w:val="0"/>
-        <w:spacing w:lineRule="auto" w:line="276" w:before="0" w:after="140"/>
-        <w:jc w:val="left"/>
-        <w:rPr/>
-      </w:pPr>
-      <w:r>
-        <w:rPr>
-          <w:rStyle w:val="Destaquemayor"/>
-        </w:rPr>
-        <w:t>Descripción:</w:t>
-      </w:r>
-      <w:r>
-        <w:rPr/>
-        <w:t xml:space="preserve"> Ataques a componentes individuales comprometen el sistema.</w:t>
-      </w:r>
-    </w:p>
-    <w:p>
-      <w:pPr>
-        <w:pStyle w:val="Cuerpodetexto"/>
-        <w:numPr>
-          <w:ilvl w:val="0"/>
-          <w:numId w:val="8"/>
-        </w:numPr>
-        <w:tabs>
-          <w:tab w:val="clear" w:pos="709"/>
-          <w:tab w:val="left" w:pos="709" w:leader="none"/>
-        </w:tabs>
-        <w:bidi w:val="0"/>
-        <w:ind w:left="709" w:hanging="283"/>
-        <w:jc w:val="left"/>
-        <w:rPr/>
-      </w:pPr>
-      <w:r>
-        <w:rPr>
-          <w:rStyle w:val="Destaquemayor"/>
-        </w:rPr>
-        <w:t>Probabilidad:</w:t>
-      </w:r>
-      <w:r>
-        <w:rPr/>
-        <w:t xml:space="preserve"> Media-Alta</w:t>
-      </w:r>
-    </w:p>
-    <w:p>
-      <w:pPr>
-        <w:pStyle w:val="Cuerpodetexto"/>
-        <w:numPr>
-          <w:ilvl w:val="0"/>
-          <w:numId w:val="8"/>
-        </w:numPr>
-        <w:tabs>
-          <w:tab w:val="clear" w:pos="709"/>
-          <w:tab w:val="left" w:pos="709" w:leader="none"/>
-        </w:tabs>
-        <w:bidi w:val="0"/>
-        <w:ind w:left="709" w:hanging="283"/>
-        <w:jc w:val="left"/>
-        <w:rPr/>
-      </w:pPr>
-      <w:r>
-        <w:rPr>
-          <w:rStyle w:val="Destaquemayor"/>
-        </w:rPr>
-        <w:t>Impacto:</w:t>
-      </w:r>
-      <w:r>
-        <w:rPr/>
-        <w:t xml:space="preserve"> Crítico</w:t>
-      </w:r>
-    </w:p>
-    <w:p>
-      <w:pPr>
-        <w:pStyle w:val="Cuerpodetexto"/>
-        <w:bidi w:val="0"/>
-        <w:spacing w:lineRule="auto" w:line="276" w:before="0" w:after="140"/>
-        <w:jc w:val="left"/>
-        <w:rPr/>
-      </w:pPr>
-      <w:r>
-        <w:rPr>
-          <w:rStyle w:val="Destaquemayor"/>
-        </w:rPr>
-        <w:t>Mitigaciones:</w:t>
-      </w:r>
-    </w:p>
-    <w:p>
-      <w:pPr>
-        <w:pStyle w:val="Cuerpodetexto"/>
-        <w:numPr>
-          <w:ilvl w:val="0"/>
-          <w:numId w:val="9"/>
-        </w:numPr>
-        <w:tabs>
-          <w:tab w:val="clear" w:pos="709"/>
-          <w:tab w:val="left" w:pos="709" w:leader="none"/>
-        </w:tabs>
-        <w:bidi w:val="0"/>
-        <w:ind w:left="709" w:hanging="283"/>
-        <w:jc w:val="left"/>
-        <w:rPr/>
-      </w:pPr>
-      <w:r>
-        <w:rPr>
-          <w:rStyle w:val="Destaquemayor"/>
-        </w:rPr>
-        <w:t>Sandboxing por componente</w:t>
-      </w:r>
-      <w:r>
-        <w:rPr/>
-        <w:t xml:space="preserve"> (gVisor/Firecracker)</w:t>
-      </w:r>
-    </w:p>
-    <w:p>
-      <w:pPr>
-        <w:pStyle w:val="Cuerpodetexto"/>
-        <w:numPr>
-          <w:ilvl w:val="0"/>
-          <w:numId w:val="9"/>
-        </w:numPr>
-        <w:tabs>
-          <w:tab w:val="clear" w:pos="709"/>
-          <w:tab w:val="left" w:pos="709" w:leader="none"/>
-        </w:tabs>
-        <w:bidi w:val="0"/>
-        <w:ind w:left="709" w:hanging="283"/>
-        <w:jc w:val="left"/>
-        <w:rPr/>
-      </w:pPr>
-      <w:r>
-        <w:rPr>
-          <w:rStyle w:val="Destaquemayor"/>
-        </w:rPr>
-        <w:t>Cifrado end-to-end</w:t>
-      </w:r>
-      <w:r>
-        <w:rPr/>
-        <w:t xml:space="preserve"> (AES-256-GCM)</w:t>
-      </w:r>
-    </w:p>
-    <w:p>
-      <w:pPr>
-        <w:pStyle w:val="Cuerpodetexto"/>
-        <w:numPr>
-          <w:ilvl w:val="0"/>
-          <w:numId w:val="9"/>
-        </w:numPr>
-        <w:tabs>
-          <w:tab w:val="clear" w:pos="709"/>
-          <w:tab w:val="left" w:pos="709" w:leader="none"/>
-        </w:tabs>
-        <w:bidi w:val="0"/>
-        <w:ind w:left="709" w:hanging="283"/>
-        <w:jc w:val="left"/>
-        <w:rPr/>
-      </w:pPr>
-      <w:r>
-        <w:rPr>
-          <w:rStyle w:val="Destaquemayor"/>
-        </w:rPr>
-        <w:t>Verificación de integridad</w:t>
-      </w:r>
-      <w:r>
-        <w:rPr/>
-        <w:t xml:space="preserve"> (secure boot/TPM)</w:t>
-      </w:r>
-    </w:p>
-    <w:p>
-      <w:pPr>
-        <w:pStyle w:val="Cuerpodetexto"/>
-        <w:numPr>
-          <w:ilvl w:val="0"/>
-          <w:numId w:val="9"/>
-        </w:numPr>
-        <w:tabs>
-          <w:tab w:val="clear" w:pos="709"/>
-          <w:tab w:val="left" w:pos="709" w:leader="none"/>
-        </w:tabs>
-        <w:bidi w:val="0"/>
-        <w:ind w:left="709" w:hanging="283"/>
-        <w:jc w:val="left"/>
-        <w:rPr/>
-      </w:pPr>
-      <w:r>
-        <w:rPr>
-          <w:rStyle w:val="Destaquemayor"/>
-        </w:rPr>
-        <w:t>Pentesting programado</w:t>
-      </w:r>
-      <w:r>
-        <w:rPr/>
-        <w:t xml:space="preserve"> cada 6 meses</w:t>
-      </w:r>
-    </w:p>
-    <w:p>
-      <w:pPr>
-        <w:pStyle w:val="Cuerpodetexto"/>
-        <w:numPr>
-          <w:ilvl w:val="0"/>
-          <w:numId w:val="0"/>
-        </w:numPr>
-        <w:bidi w:val="0"/>
-        <w:ind w:hanging="0"/>
-        <w:jc w:val="left"/>
-        <w:rPr/>
-      </w:pPr>
-      <w:r>
-        <w:rPr/>
-      </w:r>
-    </w:p>
-    <w:p>
-      <w:pPr>
-        <w:pStyle w:val="Ttulo2"/>
-        <w:numPr>
-          <w:ilvl w:val="0"/>
-          <w:numId w:val="0"/>
-        </w:numPr>
-        <w:bidi w:val="0"/>
-        <w:spacing w:before="200" w:after="120"/>
-        <w:jc w:val="left"/>
-        <w:rPr/>
-      </w:pPr>
-      <w:r>
-        <w:rPr>
-          <w:rStyle w:val="Destaquemayor"/>
-          <w:b/>
-        </w:rPr>
-        <w:t>5. Riesgo: Incompatibilidad con Modelos Específicos</w:t>
-      </w:r>
-    </w:p>
-    <w:p>
-      <w:pPr>
-        <w:pStyle w:val="Cuerpodetexto"/>
-        <w:bidi w:val="0"/>
-        <w:spacing w:lineRule="auto" w:line="276" w:before="0" w:after="140"/>
-        <w:jc w:val="left"/>
-        <w:rPr/>
-      </w:pPr>
-      <w:r>
-        <w:rPr>
-          <w:rStyle w:val="Destaquemayor"/>
-        </w:rPr>
-        <w:t>Descripción:</w:t>
-      </w:r>
-      <w:r>
-        <w:rPr/>
-        <w:t xml:space="preserve"> Algunos modelos no pueden consumir formato UMCI efectivamente.</w:t>
-      </w:r>
-    </w:p>
-    <w:p>
-      <w:pPr>
-        <w:pStyle w:val="Cuerpodetexto"/>
-        <w:numPr>
-          <w:ilvl w:val="0"/>
-          <w:numId w:val="10"/>
-        </w:numPr>
-        <w:tabs>
-          <w:tab w:val="clear" w:pos="709"/>
-          <w:tab w:val="left" w:pos="709" w:leader="none"/>
-        </w:tabs>
-        <w:bidi w:val="0"/>
-        <w:ind w:left="709" w:hanging="283"/>
-        <w:jc w:val="left"/>
-        <w:rPr/>
-      </w:pPr>
-      <w:r>
-        <w:rPr>
-          <w:rStyle w:val="Destaquemayor"/>
-        </w:rPr>
-        <w:t>Probabilidad:</w:t>
-      </w:r>
-      <w:r>
-        <w:rPr/>
-        <w:t xml:space="preserve"> Baja-Media</w:t>
-      </w:r>
-    </w:p>
-    <w:p>
-      <w:pPr>
-        <w:pStyle w:val="Cuerpodetexto"/>
-        <w:numPr>
-          <w:ilvl w:val="0"/>
-          <w:numId w:val="10"/>
-        </w:numPr>
-        <w:tabs>
-          <w:tab w:val="clear" w:pos="709"/>
-          <w:tab w:val="left" w:pos="709" w:leader="none"/>
-        </w:tabs>
-        <w:bidi w:val="0"/>
-        <w:ind w:left="709" w:hanging="283"/>
-        <w:jc w:val="left"/>
-        <w:rPr/>
-      </w:pPr>
-      <w:r>
-        <w:rPr>
-          <w:rStyle w:val="Destaquemayor"/>
-        </w:rPr>
-        <w:t>Impacto:</w:t>
-      </w:r>
-      <w:r>
-        <w:rPr/>
-        <w:t xml:space="preserve"> Medio</w:t>
-      </w:r>
-    </w:p>
-    <w:p>
-      <w:pPr>
-        <w:pStyle w:val="Cuerpodetexto"/>
-        <w:bidi w:val="0"/>
-        <w:spacing w:lineRule="auto" w:line="276" w:before="0" w:after="140"/>
-        <w:jc w:val="left"/>
-        <w:rPr/>
-      </w:pPr>
-      <w:r>
-        <w:rPr>
-          <w:rStyle w:val="Destaquemayor"/>
-        </w:rPr>
-        <w:t>Mitigaciones:</w:t>
-      </w:r>
-    </w:p>
-    <w:p>
-      <w:pPr>
-        <w:pStyle w:val="Cuerpodetexto"/>
-        <w:numPr>
-          <w:ilvl w:val="0"/>
-          <w:numId w:val="11"/>
-        </w:numPr>
-        <w:tabs>
-          <w:tab w:val="clear" w:pos="709"/>
-          <w:tab w:val="left" w:pos="709" w:leader="none"/>
-        </w:tabs>
-        <w:bidi w:val="0"/>
-        <w:ind w:left="709" w:hanging="283"/>
-        <w:jc w:val="left"/>
-        <w:rPr/>
-      </w:pPr>
-      <w:r>
-        <w:rPr>
-          <w:rStyle w:val="Destaquemayor"/>
-        </w:rPr>
-        <w:t>Suite de compatibilidad</w:t>
-      </w:r>
-      <w:r>
-        <w:rPr/>
-        <w:t xml:space="preserve"> con 10+ modelos populares</w:t>
-      </w:r>
-    </w:p>
-    <w:p>
-      <w:pPr>
-        <w:pStyle w:val="Cuerpodetexto"/>
-        <w:numPr>
-          <w:ilvl w:val="0"/>
-          <w:numId w:val="11"/>
-        </w:numPr>
-        <w:tabs>
-          <w:tab w:val="clear" w:pos="709"/>
-          <w:tab w:val="left" w:pos="709" w:leader="none"/>
-        </w:tabs>
-        <w:bidi w:val="0"/>
-        <w:ind w:left="709" w:hanging="283"/>
-        <w:jc w:val="left"/>
-        <w:rPr/>
-      </w:pPr>
-      <w:r>
-        <w:rPr>
-          <w:rStyle w:val="Destaquemayor"/>
-        </w:rPr>
-        <w:t>Adaptadores específicos</w:t>
-      </w:r>
-      <w:r>
-        <w:rPr/>
-        <w:t xml:space="preserve"> para casos problemáticos</w:t>
-      </w:r>
-    </w:p>
-    <w:p>
-      <w:pPr>
-        <w:pStyle w:val="Cuerpodetexto"/>
-        <w:numPr>
-          <w:ilvl w:val="0"/>
-          <w:numId w:val="11"/>
-        </w:numPr>
-        <w:tabs>
-          <w:tab w:val="clear" w:pos="709"/>
-          <w:tab w:val="left" w:pos="709" w:leader="none"/>
-        </w:tabs>
-        <w:bidi w:val="0"/>
-        <w:ind w:left="709" w:hanging="283"/>
-        <w:jc w:val="left"/>
-        <w:rPr/>
-      </w:pPr>
-      <w:r>
-        <w:rPr>
-          <w:rStyle w:val="Destaquemayor"/>
-        </w:rPr>
-        <w:t>Formato alternativo JSON-LD</w:t>
-      </w:r>
-    </w:p>
-    <w:p>
-      <w:pPr>
-        <w:pStyle w:val="Cuerpodetexto"/>
-        <w:numPr>
-          <w:ilvl w:val="0"/>
-          <w:numId w:val="11"/>
-        </w:numPr>
-        <w:tabs>
-          <w:tab w:val="clear" w:pos="709"/>
-          <w:tab w:val="left" w:pos="709" w:leader="none"/>
-        </w:tabs>
-        <w:bidi w:val="0"/>
-        <w:ind w:left="709" w:hanging="283"/>
-        <w:jc w:val="left"/>
-        <w:rPr/>
-      </w:pPr>
-      <w:r>
-        <w:rPr>
-          <w:rStyle w:val="Destaquemayor"/>
-        </w:rPr>
-        <w:t>Documentación clara</w:t>
-      </w:r>
-      <w:r>
-        <w:rPr/>
-        <w:t xml:space="preserve"> de requerimientos</w:t>
-      </w:r>
-    </w:p>
-    <w:p>
-      <w:pPr>
-        <w:pStyle w:val="Cuerpodetexto"/>
-        <w:numPr>
-          <w:ilvl w:val="0"/>
-          <w:numId w:val="0"/>
-        </w:numPr>
-        <w:bidi w:val="0"/>
-        <w:ind w:hanging="0"/>
-        <w:jc w:val="left"/>
-        <w:rPr/>
-      </w:pPr>
-      <w:r>
-        <w:rPr/>
-      </w:r>
-    </w:p>
-    <w:p>
-      <w:pPr>
-        <w:pStyle w:val="Ttulo2"/>
-        <w:numPr>
-          <w:ilvl w:val="0"/>
-          <w:numId w:val="0"/>
-        </w:numPr>
-        <w:bidi w:val="0"/>
-        <w:spacing w:before="200" w:after="120"/>
-        <w:jc w:val="left"/>
-        <w:rPr/>
-      </w:pPr>
-      <w:r>
-        <w:rPr>
-          <w:rStyle w:val="Destaquemayor"/>
-          <w:b/>
-        </w:rPr>
-        <w:t>6. Riesgo: Fragilidad del UMCI Listener</w:t>
-      </w:r>
-    </w:p>
-    <w:p>
-      <w:pPr>
-        <w:pStyle w:val="Cuerpodetexto"/>
-        <w:bidi w:val="0"/>
-        <w:spacing w:lineRule="auto" w:line="276" w:before="0" w:after="140"/>
-        <w:jc w:val="left"/>
-        <w:rPr/>
-      </w:pPr>
-      <w:r>
-        <w:rPr>
-          <w:rStyle w:val="Destaquemayor"/>
-        </w:rPr>
-        <w:t>Descripción:</w:t>
-      </w:r>
-      <w:r>
-        <w:rPr/>
-        <w:t xml:space="preserve"> Monitor de archivos pierde eventos o causa alto consumo.</w:t>
-      </w:r>
-    </w:p>
-    <w:p>
-      <w:pPr>
-        <w:pStyle w:val="Cuerpodetexto"/>
-        <w:numPr>
-          <w:ilvl w:val="0"/>
-          <w:numId w:val="12"/>
-        </w:numPr>
-        <w:tabs>
-          <w:tab w:val="clear" w:pos="709"/>
-          <w:tab w:val="left" w:pos="709" w:leader="none"/>
-        </w:tabs>
-        <w:bidi w:val="0"/>
-        <w:ind w:left="709" w:hanging="283"/>
-        <w:jc w:val="left"/>
-        <w:rPr/>
-      </w:pPr>
-      <w:r>
-        <w:rPr>
-          <w:rStyle w:val="Destaquemayor"/>
-        </w:rPr>
-        <w:t>Probabilidad:</w:t>
-      </w:r>
-      <w:r>
-        <w:rPr/>
-        <w:t xml:space="preserve"> Alta</w:t>
-      </w:r>
-    </w:p>
-    <w:p>
-      <w:pPr>
-        <w:pStyle w:val="Cuerpodetexto"/>
-        <w:numPr>
-          <w:ilvl w:val="0"/>
-          <w:numId w:val="12"/>
-        </w:numPr>
-        <w:tabs>
-          <w:tab w:val="clear" w:pos="709"/>
-          <w:tab w:val="left" w:pos="709" w:leader="none"/>
-        </w:tabs>
-        <w:bidi w:val="0"/>
-        <w:ind w:left="709" w:hanging="283"/>
-        <w:jc w:val="left"/>
-        <w:rPr/>
-      </w:pPr>
-      <w:r>
-        <w:rPr>
-          <w:rStyle w:val="Destaquemayor"/>
-        </w:rPr>
-        <w:t>Impacto:</w:t>
-      </w:r>
-      <w:r>
-        <w:rPr/>
-        <w:t xml:space="preserve"> Medio</w:t>
-      </w:r>
-    </w:p>
-    <w:p>
-      <w:pPr>
-        <w:pStyle w:val="Cuerpodetexto"/>
-        <w:bidi w:val="0"/>
-        <w:spacing w:lineRule="auto" w:line="276" w:before="0" w:after="140"/>
-        <w:jc w:val="left"/>
-        <w:rPr/>
-      </w:pPr>
-      <w:r>
-        <w:rPr>
-          <w:rStyle w:val="Destaquemayor"/>
-        </w:rPr>
-        <w:t>Mitigaciones:</w:t>
-      </w:r>
-    </w:p>
-    <w:p>
-      <w:pPr>
-        <w:pStyle w:val="Cuerpodetexto"/>
-        <w:numPr>
-          <w:ilvl w:val="0"/>
-          <w:numId w:val="13"/>
-        </w:numPr>
-        <w:tabs>
-          <w:tab w:val="clear" w:pos="709"/>
-          <w:tab w:val="left" w:pos="709" w:leader="none"/>
-        </w:tabs>
-        <w:bidi w:val="0"/>
-        <w:ind w:left="709" w:hanging="283"/>
-        <w:jc w:val="left"/>
-        <w:rPr/>
-      </w:pPr>
-      <w:r>
-        <w:rPr>
-          <w:rStyle w:val="Destaquemayor"/>
-        </w:rPr>
-        <w:t>Múltiples backends</w:t>
-      </w:r>
-      <w:r>
-        <w:rPr/>
-        <w:t xml:space="preserve"> + fallback polling</w:t>
-      </w:r>
-    </w:p>
-    <w:p>
-      <w:pPr>
-        <w:pStyle w:val="Cuerpodetexto"/>
-        <w:numPr>
-          <w:ilvl w:val="0"/>
-          <w:numId w:val="13"/>
-        </w:numPr>
-        <w:tabs>
-          <w:tab w:val="clear" w:pos="709"/>
-          <w:tab w:val="left" w:pos="709" w:leader="none"/>
-        </w:tabs>
-        <w:bidi w:val="0"/>
-        <w:ind w:left="709" w:hanging="283"/>
-        <w:jc w:val="left"/>
-        <w:rPr/>
-      </w:pPr>
-      <w:r>
-        <w:rPr>
-          <w:rStyle w:val="Destaquemayor"/>
-        </w:rPr>
-        <w:t>Límites de rate-limiting</w:t>
-      </w:r>
-      <w:r>
-        <w:rPr/>
-        <w:t xml:space="preserve"> configurables</w:t>
-      </w:r>
-    </w:p>
-    <w:p>
-      <w:pPr>
-        <w:pStyle w:val="Cuerpodetexto"/>
-        <w:numPr>
-          <w:ilvl w:val="0"/>
-          <w:numId w:val="13"/>
-        </w:numPr>
-        <w:tabs>
-          <w:tab w:val="clear" w:pos="709"/>
-          <w:tab w:val="left" w:pos="709" w:leader="none"/>
-        </w:tabs>
-        <w:bidi w:val="0"/>
-        <w:ind w:left="709" w:hanging="283"/>
-        <w:jc w:val="left"/>
-        <w:rPr/>
-      </w:pPr>
-      <w:r>
-        <w:rPr>
-          <w:rStyle w:val="Destaquemayor"/>
-        </w:rPr>
-        <w:t>Modo "batch processing"</w:t>
-      </w:r>
-      <w:r>
-        <w:rPr/>
-        <w:t xml:space="preserve"> para sistemas activos</w:t>
-      </w:r>
-    </w:p>
-    <w:p>
-      <w:pPr>
-        <w:pStyle w:val="Cuerpodetexto"/>
-        <w:numPr>
-          <w:ilvl w:val="0"/>
-          <w:numId w:val="13"/>
-        </w:numPr>
-        <w:tabs>
-          <w:tab w:val="clear" w:pos="709"/>
-          <w:tab w:val="left" w:pos="709" w:leader="none"/>
-        </w:tabs>
-        <w:bidi w:val="0"/>
-        <w:ind w:left="709" w:hanging="283"/>
-        <w:jc w:val="left"/>
-        <w:rPr/>
-      </w:pPr>
-      <w:r>
-        <w:rPr>
-          <w:rStyle w:val="Destaquemayor"/>
-        </w:rPr>
-        <w:t>Health checks automáticos</w:t>
-      </w:r>
-    </w:p>
-    <w:p>
-      <w:pPr>
-        <w:pStyle w:val="Cuerpodetexto"/>
-        <w:bidi w:val="0"/>
-        <w:spacing w:lineRule="auto" w:line="276" w:before="0" w:after="140"/>
-        <w:jc w:val="left"/>
-        <w:rPr>
-          <w:rStyle w:val="Destaquemayor"/>
-        </w:rPr>
-      </w:pPr>
-      <w:r>
-        <w:rPr/>
-      </w:r>
-    </w:p>
-    <w:p>
-      <w:pPr>
-        <w:pStyle w:val="Ttulo2"/>
-        <w:numPr>
-          <w:ilvl w:val="0"/>
-          <w:numId w:val="0"/>
-        </w:numPr>
-        <w:bidi w:val="0"/>
-        <w:spacing w:before="200" w:after="120"/>
-        <w:jc w:val="left"/>
-        <w:rPr/>
-      </w:pPr>
-      <w:r>
-        <w:rPr>
-          <w:rStyle w:val="Destaquemayor"/>
-          <w:b/>
-        </w:rPr>
-        <w:t>7. Riesgo: Complejidad de Despliegue Empresarial</w:t>
-      </w:r>
-    </w:p>
-    <w:p>
-      <w:pPr>
-        <w:pStyle w:val="Cuerpodetexto"/>
-        <w:bidi w:val="0"/>
-        <w:spacing w:lineRule="auto" w:line="276" w:before="0" w:after="140"/>
-        <w:jc w:val="left"/>
-        <w:rPr/>
-      </w:pPr>
-      <w:r>
-        <w:rPr>
-          <w:rStyle w:val="Destaquemayor"/>
-        </w:rPr>
-        <w:t>Descripción:</w:t>
-      </w:r>
-      <w:r>
-        <w:rPr/>
-        <w:t xml:space="preserve"> Dificultad de integración en entornos existentes.</w:t>
-      </w:r>
-    </w:p>
-    <w:p>
-      <w:pPr>
-        <w:pStyle w:val="Cuerpodetexto"/>
-        <w:numPr>
-          <w:ilvl w:val="0"/>
-          <w:numId w:val="14"/>
-        </w:numPr>
-        <w:tabs>
-          <w:tab w:val="clear" w:pos="709"/>
-          <w:tab w:val="left" w:pos="709" w:leader="none"/>
-        </w:tabs>
-        <w:bidi w:val="0"/>
-        <w:ind w:left="709" w:hanging="283"/>
-        <w:jc w:val="left"/>
-        <w:rPr/>
-      </w:pPr>
-      <w:r>
-        <w:rPr>
-          <w:rStyle w:val="Destaquemayor"/>
-        </w:rPr>
-        <w:t>Probabilidad:</w:t>
-      </w:r>
-      <w:r>
-        <w:rPr/>
-        <w:t xml:space="preserve"> Media</w:t>
-      </w:r>
-    </w:p>
-    <w:p>
-      <w:pPr>
-        <w:pStyle w:val="Cuerpodetexto"/>
-        <w:numPr>
-          <w:ilvl w:val="0"/>
-          <w:numId w:val="14"/>
-        </w:numPr>
-        <w:tabs>
-          <w:tab w:val="clear" w:pos="709"/>
-          <w:tab w:val="left" w:pos="709" w:leader="none"/>
-        </w:tabs>
-        <w:bidi w:val="0"/>
-        <w:ind w:left="709" w:hanging="283"/>
-        <w:jc w:val="left"/>
-        <w:rPr/>
-      </w:pPr>
-      <w:r>
-        <w:rPr>
-          <w:rStyle w:val="Destaquemayor"/>
-        </w:rPr>
-        <w:t>Impacto:</w:t>
-      </w:r>
-      <w:r>
-        <w:rPr/>
-        <w:t xml:space="preserve"> Medio</w:t>
-      </w:r>
-    </w:p>
-    <w:p>
-      <w:pPr>
-        <w:pStyle w:val="Cuerpodetexto"/>
-        <w:bidi w:val="0"/>
-        <w:spacing w:lineRule="auto" w:line="276" w:before="0" w:after="140"/>
-        <w:jc w:val="left"/>
-        <w:rPr/>
-      </w:pPr>
-      <w:r>
-        <w:rPr>
-          <w:rStyle w:val="Destaquemayor"/>
-        </w:rPr>
-        <w:t>Mitigaciones:</w:t>
-      </w:r>
-    </w:p>
-    <w:p>
-      <w:pPr>
-        <w:pStyle w:val="Cuerpodetexto"/>
-        <w:numPr>
-          <w:ilvl w:val="0"/>
-          <w:numId w:val="15"/>
-        </w:numPr>
-        <w:tabs>
-          <w:tab w:val="clear" w:pos="709"/>
-          <w:tab w:val="left" w:pos="709" w:leader="none"/>
-        </w:tabs>
-        <w:bidi w:val="0"/>
-        <w:ind w:left="709" w:hanging="283"/>
-        <w:jc w:val="left"/>
-        <w:rPr/>
-      </w:pPr>
-      <w:r>
-        <w:rPr>
-          <w:rStyle w:val="Destaquemayor"/>
-        </w:rPr>
-        <w:t>Containers Docker</w:t>
-      </w:r>
-      <w:r>
-        <w:rPr/>
-        <w:t xml:space="preserve"> pre-configurados</w:t>
-      </w:r>
-    </w:p>
-    <w:p>
-      <w:pPr>
-        <w:pStyle w:val="Cuerpodetexto"/>
-        <w:numPr>
-          <w:ilvl w:val="0"/>
-          <w:numId w:val="15"/>
-        </w:numPr>
-        <w:tabs>
-          <w:tab w:val="clear" w:pos="709"/>
-          <w:tab w:val="left" w:pos="709" w:leader="none"/>
-        </w:tabs>
-        <w:bidi w:val="0"/>
-        <w:ind w:left="709" w:hanging="283"/>
-        <w:jc w:val="left"/>
-        <w:rPr/>
-      </w:pPr>
-      <w:r>
-        <w:rPr>
-          <w:rStyle w:val="Destaquemayor"/>
-        </w:rPr>
-        <w:t>Helm charts</w:t>
-      </w:r>
-      <w:r>
-        <w:rPr/>
-        <w:t xml:space="preserve"> para Kubernetes</w:t>
-      </w:r>
-    </w:p>
-    <w:p>
-      <w:pPr>
-        <w:pStyle w:val="Cuerpodetexto"/>
-        <w:numPr>
-          <w:ilvl w:val="0"/>
-          <w:numId w:val="15"/>
-        </w:numPr>
-        <w:tabs>
-          <w:tab w:val="clear" w:pos="709"/>
-          <w:tab w:val="left" w:pos="709" w:leader="none"/>
-        </w:tabs>
-        <w:bidi w:val="0"/>
-        <w:ind w:left="709" w:hanging="283"/>
-        <w:jc w:val="left"/>
-        <w:rPr/>
-      </w:pPr>
-      <w:r>
-        <w:rPr>
-          <w:rStyle w:val="Destaquemayor"/>
-        </w:rPr>
-        <w:t>Guías de despliegue</w:t>
-      </w:r>
-      <w:r>
-        <w:rPr/>
-        <w:t xml:space="preserve"> para entornos comunes</w:t>
-      </w:r>
-    </w:p>
-    <w:p>
-      <w:pPr>
-        <w:pStyle w:val="Cuerpodetexto"/>
-        <w:numPr>
-          <w:ilvl w:val="0"/>
-          <w:numId w:val="15"/>
-        </w:numPr>
-        <w:tabs>
-          <w:tab w:val="clear" w:pos="709"/>
-          <w:tab w:val="left" w:pos="709" w:leader="none"/>
-        </w:tabs>
-        <w:bidi w:val="0"/>
-        <w:ind w:left="709" w:hanging="283"/>
-        <w:jc w:val="left"/>
-        <w:rPr/>
-      </w:pPr>
-      <w:r>
-        <w:rPr>
-          <w:rStyle w:val="Destaquemayor"/>
+          <w:rStyle w:val="Strong"/>
         </w:rPr>
         <w:t>Modo "enterprise"</w:t>
       </w:r>
@@ -1627,12 +1602,13 @@
         </w:numPr>
         <w:bidi w:val="0"/>
         <w:spacing w:before="200" w:after="120"/>
-        <w:jc w:val="left"/>
-        <w:rPr/>
-      </w:pPr>
-      <w:r>
-        <w:rPr>
-          <w:rStyle w:val="Destaquemayor"/>
+        <w:ind w:left="0" w:hanging="0"/>
+        <w:jc w:val="left"/>
+        <w:rPr/>
+      </w:pPr>
+      <w:r>
+        <w:rPr>
+          <w:rStyle w:val="Strong"/>
           <w:b/>
         </w:rPr>
         <w:t>Plan de Monitorización de Riesgos</w:t>
@@ -1645,7 +1621,7 @@
         <w:spacing w:lineRule="auto" w:line="276" w:before="0" w:after="140"/>
         <w:jc w:val="left"/>
         <w:rPr>
-          <w:rStyle w:val="Destaquemayor"/>
+          <w:rStyle w:val="Strong"/>
         </w:rPr>
       </w:pPr>
       <w:r>
@@ -1666,8 +1642,8 @@
         </w:tblCellMar>
       </w:tblPr>
       <w:tblGrid>
-        <w:gridCol w:w="2328"/>
-        <w:gridCol w:w="1919"/>
+        <w:gridCol w:w="2327"/>
+        <w:gridCol w:w="1920"/>
         <w:gridCol w:w="3277"/>
       </w:tblGrid>
       <w:tr>
@@ -1676,13 +1652,14 @@
         </w:trPr>
         <w:tc>
           <w:tcPr>
-            <w:tcW w:w="2328" w:type="dxa"/>
+            <w:tcW w:w="2327" w:type="dxa"/>
             <w:tcBorders/>
             <w:vAlign w:val="center"/>
           </w:tcPr>
           <w:p>
             <w:pPr>
               <w:pStyle w:val="Ttulodelatabla"/>
+              <w:widowControl w:val="false"/>
               <w:suppressLineNumbers/>
               <w:bidi w:val="0"/>
               <w:jc w:val="center"/>
@@ -1696,13 +1673,14 @@
         </w:tc>
         <w:tc>
           <w:tcPr>
-            <w:tcW w:w="1919" w:type="dxa"/>
+            <w:tcW w:w="1920" w:type="dxa"/>
             <w:tcBorders/>
             <w:vAlign w:val="center"/>
           </w:tcPr>
           <w:p>
             <w:pPr>
               <w:pStyle w:val="Ttulodelatabla"/>
+              <w:widowControl w:val="false"/>
               <w:suppressLineNumbers/>
               <w:bidi w:val="0"/>
               <w:jc w:val="center"/>
@@ -1723,6 +1701,7 @@
           <w:p>
             <w:pPr>
               <w:pStyle w:val="Ttulodelatabla"/>
+              <w:widowControl w:val="false"/>
               <w:suppressLineNumbers/>
               <w:bidi w:val="0"/>
               <w:jc w:val="center"/>
@@ -1739,7 +1718,7 @@
         <w:trPr/>
         <w:tc>
           <w:tcPr>
-            <w:tcW w:w="2328" w:type="dxa"/>
+            <w:tcW w:w="2327" w:type="dxa"/>
             <w:tcBorders/>
             <w:vAlign w:val="center"/>
           </w:tcPr>
@@ -1760,7 +1739,7 @@
         </w:tc>
         <w:tc>
           <w:tcPr>
-            <w:tcW w:w="1919" w:type="dxa"/>
+            <w:tcW w:w="1920" w:type="dxa"/>
             <w:tcBorders/>
             <w:vAlign w:val="center"/>
           </w:tcPr>
@@ -1805,7 +1784,7 @@
         <w:trPr/>
         <w:tc>
           <w:tcPr>
-            <w:tcW w:w="2328" w:type="dxa"/>
+            <w:tcW w:w="2327" w:type="dxa"/>
             <w:tcBorders/>
             <w:vAlign w:val="center"/>
           </w:tcPr>
@@ -1826,7 +1805,7 @@
         </w:tc>
         <w:tc>
           <w:tcPr>
-            <w:tcW w:w="1919" w:type="dxa"/>
+            <w:tcW w:w="1920" w:type="dxa"/>
             <w:tcBorders/>
             <w:vAlign w:val="center"/>
           </w:tcPr>
@@ -1871,7 +1850,7 @@
         <w:trPr/>
         <w:tc>
           <w:tcPr>
-            <w:tcW w:w="2328" w:type="dxa"/>
+            <w:tcW w:w="2327" w:type="dxa"/>
             <w:tcBorders/>
             <w:vAlign w:val="center"/>
           </w:tcPr>
@@ -1892,7 +1871,7 @@
         </w:tc>
         <w:tc>
           <w:tcPr>
-            <w:tcW w:w="1919" w:type="dxa"/>
+            <w:tcW w:w="1920" w:type="dxa"/>
             <w:tcBorders/>
             <w:vAlign w:val="center"/>
           </w:tcPr>
@@ -1937,7 +1916,7 @@
         <w:trPr/>
         <w:tc>
           <w:tcPr>
-            <w:tcW w:w="2328" w:type="dxa"/>
+            <w:tcW w:w="2327" w:type="dxa"/>
             <w:tcBorders/>
             <w:vAlign w:val="center"/>
           </w:tcPr>
@@ -1958,7 +1937,7 @@
         </w:tc>
         <w:tc>
           <w:tcPr>
-            <w:tcW w:w="1919" w:type="dxa"/>
+            <w:tcW w:w="1920" w:type="dxa"/>
             <w:tcBorders/>
             <w:vAlign w:val="center"/>
           </w:tcPr>
@@ -2003,7 +1982,7 @@
         <w:trPr/>
         <w:tc>
           <w:tcPr>
-            <w:tcW w:w="2328" w:type="dxa"/>
+            <w:tcW w:w="2327" w:type="dxa"/>
             <w:tcBorders/>
             <w:vAlign w:val="center"/>
           </w:tcPr>
@@ -2024,7 +2003,7 @@
         </w:tc>
         <w:tc>
           <w:tcPr>
-            <w:tcW w:w="1919" w:type="dxa"/>
+            <w:tcW w:w="1920" w:type="dxa"/>
             <w:tcBorders/>
             <w:vAlign w:val="center"/>
           </w:tcPr>
@@ -2073,7 +2052,7 @@
         <w:spacing w:lineRule="auto" w:line="276" w:before="0" w:after="140"/>
         <w:jc w:val="left"/>
         <w:rPr>
-          <w:rStyle w:val="Destaquemayor"/>
+          <w:rStyle w:val="Strong"/>
         </w:rPr>
       </w:pPr>
       <w:r>
@@ -2090,7 +2069,7 @@
       </w:pPr>
       <w:r>
         <w:rPr>
-          <w:rStyle w:val="Destaquemayor"/>
+          <w:rStyle w:val="Strong"/>
         </w:rPr>
         <w:t>Revisión trimestral</w:t>
       </w:r>
@@ -2140,120 +2119,138 @@
   <w:abstractNum w:abstractNumId="1">
     <w:lvl w:ilvl="0">
       <w:start w:val="1"/>
-      <w:numFmt w:val="none"/>
-      <w:suff w:val="nothing"/>
-      <w:lvlText w:val="%1"/>
-      <w:lvlJc w:val="left"/>
-      <w:pPr>
-        <w:tabs>
-          <w:tab w:val="num" w:pos="0"/>
-        </w:tabs>
-        <w:ind w:left="0" w:hanging="0"/>
-      </w:pPr>
+      <w:numFmt w:val="bullet"/>
+      <w:lvlText w:val=""/>
+      <w:lvlJc w:val="left"/>
+      <w:pPr>
+        <w:tabs>
+          <w:tab w:val="num" w:pos="709"/>
+        </w:tabs>
+        <w:ind w:left="709" w:hanging="283"/>
+      </w:pPr>
+      <w:rPr>
+        <w:rFonts w:ascii="Symbol" w:hAnsi="Symbol" w:cs="Symbol" w:hint="default"/>
+      </w:rPr>
     </w:lvl>
     <w:lvl w:ilvl="1">
       <w:start w:val="1"/>
-      <w:numFmt w:val="none"/>
-      <w:suff w:val="nothing"/>
-      <w:lvlText w:val="%2"/>
-      <w:lvlJc w:val="left"/>
-      <w:pPr>
-        <w:tabs>
-          <w:tab w:val="num" w:pos="0"/>
-        </w:tabs>
-        <w:ind w:left="0" w:hanging="0"/>
-      </w:pPr>
+      <w:numFmt w:val="bullet"/>
+      <w:lvlText w:val=""/>
+      <w:lvlJc w:val="left"/>
+      <w:pPr>
+        <w:tabs>
+          <w:tab w:val="num" w:pos="1418"/>
+        </w:tabs>
+        <w:ind w:left="1418" w:hanging="283"/>
+      </w:pPr>
+      <w:rPr>
+        <w:rFonts w:ascii="Symbol" w:hAnsi="Symbol" w:cs="Symbol" w:hint="default"/>
+      </w:rPr>
     </w:lvl>
     <w:lvl w:ilvl="2">
       <w:start w:val="1"/>
-      <w:numFmt w:val="none"/>
-      <w:suff w:val="nothing"/>
-      <w:lvlText w:val="%3"/>
-      <w:lvlJc w:val="left"/>
-      <w:pPr>
-        <w:tabs>
-          <w:tab w:val="num" w:pos="0"/>
-        </w:tabs>
-        <w:ind w:left="0" w:hanging="0"/>
-      </w:pPr>
+      <w:numFmt w:val="bullet"/>
+      <w:lvlText w:val=""/>
+      <w:lvlJc w:val="left"/>
+      <w:pPr>
+        <w:tabs>
+          <w:tab w:val="num" w:pos="2127"/>
+        </w:tabs>
+        <w:ind w:left="2127" w:hanging="283"/>
+      </w:pPr>
+      <w:rPr>
+        <w:rFonts w:ascii="Symbol" w:hAnsi="Symbol" w:cs="Symbol" w:hint="default"/>
+      </w:rPr>
     </w:lvl>
     <w:lvl w:ilvl="3">
       <w:start w:val="1"/>
-      <w:numFmt w:val="none"/>
-      <w:suff w:val="nothing"/>
-      <w:lvlText w:val="%4"/>
-      <w:lvlJc w:val="left"/>
-      <w:pPr>
-        <w:tabs>
-          <w:tab w:val="num" w:pos="0"/>
-        </w:tabs>
-        <w:ind w:left="0" w:hanging="0"/>
-      </w:pPr>
+      <w:numFmt w:val="bullet"/>
+      <w:lvlText w:val=""/>
+      <w:lvlJc w:val="left"/>
+      <w:pPr>
+        <w:tabs>
+          <w:tab w:val="num" w:pos="2836"/>
+        </w:tabs>
+        <w:ind w:left="2836" w:hanging="283"/>
+      </w:pPr>
+      <w:rPr>
+        <w:rFonts w:ascii="Symbol" w:hAnsi="Symbol" w:cs="Symbol" w:hint="default"/>
+      </w:rPr>
     </w:lvl>
     <w:lvl w:ilvl="4">
       <w:start w:val="1"/>
-      <w:numFmt w:val="none"/>
-      <w:suff w:val="nothing"/>
-      <w:lvlText w:val="%5"/>
-      <w:lvlJc w:val="left"/>
-      <w:pPr>
-        <w:tabs>
-          <w:tab w:val="num" w:pos="0"/>
-        </w:tabs>
-        <w:ind w:left="0" w:hanging="0"/>
-      </w:pPr>
+      <w:numFmt w:val="bullet"/>
+      <w:lvlText w:val=""/>
+      <w:lvlJc w:val="left"/>
+      <w:pPr>
+        <w:tabs>
+          <w:tab w:val="num" w:pos="3545"/>
+        </w:tabs>
+        <w:ind w:left="3545" w:hanging="283"/>
+      </w:pPr>
+      <w:rPr>
+        <w:rFonts w:ascii="Symbol" w:hAnsi="Symbol" w:cs="Symbol" w:hint="default"/>
+      </w:rPr>
     </w:lvl>
     <w:lvl w:ilvl="5">
       <w:start w:val="1"/>
-      <w:numFmt w:val="none"/>
-      <w:suff w:val="nothing"/>
-      <w:lvlText w:val="%6"/>
-      <w:lvlJc w:val="left"/>
-      <w:pPr>
-        <w:tabs>
-          <w:tab w:val="num" w:pos="0"/>
-        </w:tabs>
-        <w:ind w:left="0" w:hanging="0"/>
-      </w:pPr>
+      <w:numFmt w:val="bullet"/>
+      <w:lvlText w:val=""/>
+      <w:lvlJc w:val="left"/>
+      <w:pPr>
+        <w:tabs>
+          <w:tab w:val="num" w:pos="4254"/>
+        </w:tabs>
+        <w:ind w:left="4254" w:hanging="283"/>
+      </w:pPr>
+      <w:rPr>
+        <w:rFonts w:ascii="Symbol" w:hAnsi="Symbol" w:cs="Symbol" w:hint="default"/>
+      </w:rPr>
     </w:lvl>
     <w:lvl w:ilvl="6">
       <w:start w:val="1"/>
-      <w:numFmt w:val="none"/>
-      <w:suff w:val="nothing"/>
-      <w:lvlText w:val="%7"/>
-      <w:lvlJc w:val="left"/>
-      <w:pPr>
-        <w:tabs>
-          <w:tab w:val="num" w:pos="0"/>
-        </w:tabs>
-        <w:ind w:left="0" w:hanging="0"/>
-      </w:pPr>
+      <w:numFmt w:val="bullet"/>
+      <w:lvlText w:val=""/>
+      <w:lvlJc w:val="left"/>
+      <w:pPr>
+        <w:tabs>
+          <w:tab w:val="num" w:pos="4963"/>
+        </w:tabs>
+        <w:ind w:left="4963" w:hanging="283"/>
+      </w:pPr>
+      <w:rPr>
+        <w:rFonts w:ascii="Symbol" w:hAnsi="Symbol" w:cs="Symbol" w:hint="default"/>
+      </w:rPr>
     </w:lvl>
     <w:lvl w:ilvl="7">
       <w:start w:val="1"/>
-      <w:numFmt w:val="none"/>
-      <w:suff w:val="nothing"/>
-      <w:lvlText w:val="%8"/>
-      <w:lvlJc w:val="left"/>
-      <w:pPr>
-        <w:tabs>
-          <w:tab w:val="num" w:pos="0"/>
-        </w:tabs>
-        <w:ind w:left="0" w:hanging="0"/>
-      </w:pPr>
+      <w:numFmt w:val="bullet"/>
+      <w:lvlText w:val=""/>
+      <w:lvlJc w:val="left"/>
+      <w:pPr>
+        <w:tabs>
+          <w:tab w:val="num" w:pos="5672"/>
+        </w:tabs>
+        <w:ind w:left="5672" w:hanging="283"/>
+      </w:pPr>
+      <w:rPr>
+        <w:rFonts w:ascii="Symbol" w:hAnsi="Symbol" w:cs="Symbol" w:hint="default"/>
+      </w:rPr>
     </w:lvl>
     <w:lvl w:ilvl="8">
       <w:start w:val="1"/>
-      <w:numFmt w:val="none"/>
-      <w:suff w:val="nothing"/>
-      <w:lvlText w:val="%9"/>
-      <w:lvlJc w:val="left"/>
-      <w:pPr>
-        <w:tabs>
-          <w:tab w:val="num" w:pos="0"/>
-        </w:tabs>
-        <w:ind w:left="0" w:hanging="0"/>
-      </w:pPr>
+      <w:numFmt w:val="bullet"/>
+      <w:lvlText w:val=""/>
+      <w:lvlJc w:val="left"/>
+      <w:pPr>
+        <w:tabs>
+          <w:tab w:val="num" w:pos="6381"/>
+        </w:tabs>
+        <w:ind w:left="6381" w:hanging="283"/>
+      </w:pPr>
+      <w:rPr>
+        <w:rFonts w:ascii="Symbol" w:hAnsi="Symbol" w:cs="Symbol" w:hint="default"/>
+      </w:rPr>
     </w:lvl>
   </w:abstractNum>
   <w:abstractNum w:abstractNumId="2">
@@ -4040,138 +4037,120 @@
   <w:abstractNum w:abstractNumId="15">
     <w:lvl w:ilvl="0">
       <w:start w:val="1"/>
-      <w:numFmt w:val="bullet"/>
-      <w:lvlText w:val=""/>
-      <w:lvlJc w:val="left"/>
-      <w:pPr>
-        <w:tabs>
-          <w:tab w:val="num" w:pos="709"/>
-        </w:tabs>
-        <w:ind w:left="709" w:hanging="283"/>
-      </w:pPr>
-      <w:rPr>
-        <w:rFonts w:ascii="Symbol" w:hAnsi="Symbol" w:cs="Symbol" w:hint="default"/>
-      </w:rPr>
+      <w:numFmt w:val="none"/>
+      <w:suff w:val="nothing"/>
+      <w:lvlText w:val=""/>
+      <w:lvlJc w:val="left"/>
+      <w:pPr>
+        <w:tabs>
+          <w:tab w:val="num" w:pos="0"/>
+        </w:tabs>
+        <w:ind w:left="0" w:hanging="0"/>
+      </w:pPr>
     </w:lvl>
     <w:lvl w:ilvl="1">
       <w:start w:val="1"/>
-      <w:numFmt w:val="bullet"/>
-      <w:lvlText w:val=""/>
-      <w:lvlJc w:val="left"/>
-      <w:pPr>
-        <w:tabs>
-          <w:tab w:val="num" w:pos="1418"/>
-        </w:tabs>
-        <w:ind w:left="1418" w:hanging="283"/>
-      </w:pPr>
-      <w:rPr>
-        <w:rFonts w:ascii="Symbol" w:hAnsi="Symbol" w:cs="Symbol" w:hint="default"/>
-      </w:rPr>
+      <w:numFmt w:val="none"/>
+      <w:suff w:val="nothing"/>
+      <w:lvlText w:val=""/>
+      <w:lvlJc w:val="left"/>
+      <w:pPr>
+        <w:tabs>
+          <w:tab w:val="num" w:pos="0"/>
+        </w:tabs>
+        <w:ind w:left="0" w:hanging="0"/>
+      </w:pPr>
     </w:lvl>
     <w:lvl w:ilvl="2">
       <w:start w:val="1"/>
-      <w:numFmt w:val="bullet"/>
-      <w:lvlText w:val=""/>
-      <w:lvlJc w:val="left"/>
-      <w:pPr>
-        <w:tabs>
-          <w:tab w:val="num" w:pos="2127"/>
-        </w:tabs>
-        <w:ind w:left="2127" w:hanging="283"/>
-      </w:pPr>
-      <w:rPr>
-        <w:rFonts w:ascii="Symbol" w:hAnsi="Symbol" w:cs="Symbol" w:hint="default"/>
-      </w:rPr>
+      <w:numFmt w:val="none"/>
+      <w:suff w:val="nothing"/>
+      <w:lvlText w:val=""/>
+      <w:lvlJc w:val="left"/>
+      <w:pPr>
+        <w:tabs>
+          <w:tab w:val="num" w:pos="0"/>
+        </w:tabs>
+        <w:ind w:left="0" w:hanging="0"/>
+      </w:pPr>
     </w:lvl>
     <w:lvl w:ilvl="3">
       <w:start w:val="1"/>
-      <w:numFmt w:val="bullet"/>
-      <w:lvlText w:val=""/>
-      <w:lvlJc w:val="left"/>
-      <w:pPr>
-        <w:tabs>
-          <w:tab w:val="num" w:pos="2836"/>
-        </w:tabs>
-        <w:ind w:left="2836" w:hanging="283"/>
-      </w:pPr>
-      <w:rPr>
-        <w:rFonts w:ascii="Symbol" w:hAnsi="Symbol" w:cs="Symbol" w:hint="default"/>
-      </w:rPr>
+      <w:numFmt w:val="none"/>
+      <w:suff w:val="nothing"/>
+      <w:lvlText w:val=""/>
+      <w:lvlJc w:val="left"/>
+      <w:pPr>
+        <w:tabs>
+          <w:tab w:val="num" w:pos="0"/>
+        </w:tabs>
+        <w:ind w:left="0" w:hanging="0"/>
+      </w:pPr>
     </w:lvl>
     <w:lvl w:ilvl="4">
       <w:start w:val="1"/>
-      <w:numFmt w:val="bullet"/>
-      <w:lvlText w:val=""/>
-      <w:lvlJc w:val="left"/>
-      <w:pPr>
-        <w:tabs>
-          <w:tab w:val="num" w:pos="3545"/>
-        </w:tabs>
-        <w:ind w:left="3545" w:hanging="283"/>
-      </w:pPr>
-      <w:rPr>
-        <w:rFonts w:ascii="Symbol" w:hAnsi="Symbol" w:cs="Symbol" w:hint="default"/>
-      </w:rPr>
+      <w:numFmt w:val="none"/>
+      <w:suff w:val="nothing"/>
+      <w:lvlText w:val=""/>
+      <w:lvlJc w:val="left"/>
+      <w:pPr>
+        <w:tabs>
+          <w:tab w:val="num" w:pos="0"/>
+        </w:tabs>
+        <w:ind w:left="0" w:hanging="0"/>
+      </w:pPr>
     </w:lvl>
     <w:lvl w:ilvl="5">
       <w:start w:val="1"/>
-      <w:numFmt w:val="bullet"/>
-      <w:lvlText w:val=""/>
-      <w:lvlJc w:val="left"/>
-      <w:pPr>
-        <w:tabs>
-          <w:tab w:val="num" w:pos="4254"/>
-        </w:tabs>
-        <w:ind w:left="4254" w:hanging="283"/>
-      </w:pPr>
-      <w:rPr>
-        <w:rFonts w:ascii="Symbol" w:hAnsi="Symbol" w:cs="Symbol" w:hint="default"/>
-      </w:rPr>
+      <w:numFmt w:val="none"/>
+      <w:suff w:val="nothing"/>
+      <w:lvlText w:val=""/>
+      <w:lvlJc w:val="left"/>
+      <w:pPr>
+        <w:tabs>
+          <w:tab w:val="num" w:pos="0"/>
+        </w:tabs>
+        <w:ind w:left="0" w:hanging="0"/>
+      </w:pPr>
     </w:lvl>
     <w:lvl w:ilvl="6">
       <w:start w:val="1"/>
-      <w:numFmt w:val="bullet"/>
-      <w:lvlText w:val=""/>
-      <w:lvlJc w:val="left"/>
-      <w:pPr>
-        <w:tabs>
-          <w:tab w:val="num" w:pos="4963"/>
-        </w:tabs>
-        <w:ind w:left="4963" w:hanging="283"/>
-      </w:pPr>
-      <w:rPr>
-        <w:rFonts w:ascii="Symbol" w:hAnsi="Symbol" w:cs="Symbol" w:hint="default"/>
-      </w:rPr>
+      <w:numFmt w:val="none"/>
+      <w:suff w:val="nothing"/>
+      <w:lvlText w:val=""/>
+      <w:lvlJc w:val="left"/>
+      <w:pPr>
+        <w:tabs>
+          <w:tab w:val="num" w:pos="0"/>
+        </w:tabs>
+        <w:ind w:left="0" w:hanging="0"/>
+      </w:pPr>
     </w:lvl>
     <w:lvl w:ilvl="7">
       <w:start w:val="1"/>
-      <w:numFmt w:val="bullet"/>
-      <w:lvlText w:val=""/>
-      <w:lvlJc w:val="left"/>
-      <w:pPr>
-        <w:tabs>
-          <w:tab w:val="num" w:pos="5672"/>
-        </w:tabs>
-        <w:ind w:left="5672" w:hanging="283"/>
-      </w:pPr>
-      <w:rPr>
-        <w:rFonts w:ascii="Symbol" w:hAnsi="Symbol" w:cs="Symbol" w:hint="default"/>
-      </w:rPr>
+      <w:numFmt w:val="none"/>
+      <w:suff w:val="nothing"/>
+      <w:lvlText w:val=""/>
+      <w:lvlJc w:val="left"/>
+      <w:pPr>
+        <w:tabs>
+          <w:tab w:val="num" w:pos="0"/>
+        </w:tabs>
+        <w:ind w:left="0" w:hanging="0"/>
+      </w:pPr>
     </w:lvl>
     <w:lvl w:ilvl="8">
       <w:start w:val="1"/>
-      <w:numFmt w:val="bullet"/>
-      <w:lvlText w:val=""/>
-      <w:lvlJc w:val="left"/>
-      <w:pPr>
-        <w:tabs>
-          <w:tab w:val="num" w:pos="6381"/>
-        </w:tabs>
-        <w:ind w:left="6381" w:hanging="283"/>
-      </w:pPr>
-      <w:rPr>
-        <w:rFonts w:ascii="Symbol" w:hAnsi="Symbol" w:cs="Symbol" w:hint="default"/>
-      </w:rPr>
+      <w:numFmt w:val="none"/>
+      <w:suff w:val="nothing"/>
+      <w:lvlText w:val=""/>
+      <w:lvlJc w:val="left"/>
+      <w:pPr>
+        <w:tabs>
+          <w:tab w:val="num" w:pos="0"/>
+        </w:tabs>
+        <w:ind w:left="0" w:hanging="0"/>
+      </w:pPr>
     </w:lvl>
   </w:abstractNum>
   <w:num w:numId="1">
@@ -4236,7 +4215,6 @@
     </w:rPrDefault>
     <w:pPrDefault>
       <w:pPr>
-        <w:widowControl/>
         <w:suppressAutoHyphens w:val="true"/>
       </w:pPr>
     </w:pPrDefault>
@@ -4246,10 +4224,11 @@
     <w:qFormat/>
     <w:pPr>
       <w:widowControl/>
-      <w:kinsoku w:val="true"/>
-      <w:overflowPunct w:val="true"/>
-      <w:autoSpaceDE w:val="true"/>
+      <w:suppressAutoHyphens w:val="true"/>
+      <w:overflowPunct w:val="false"/>
       <w:bidi w:val="0"/>
+      <w:spacing w:before="0" w:after="0"/>
+      <w:jc w:val="left"/>
     </w:pPr>
     <w:rPr>
       <w:rFonts w:ascii="Liberation Serif" w:hAnsi="Liberation Serif" w:eastAsia="Noto Serif CJK SC" w:cs="Lohit Devanagari"/>
@@ -4302,7 +4281,7 @@
       <w:szCs w:val="36"/>
     </w:rPr>
   </w:style>
-  <w:style w:type="character" w:styleId="Destaquemayor">
+  <w:style w:type="character" w:styleId="Strong">
     <w:name w:val="Strong"/>
     <w:qFormat/>
     <w:rPr>

</xml_diff>